<commit_message>
RM Lisura: cortesia de 3 relatorios agora e unica (nao mensal)
</commit_message>
<xml_diff>
--- a/Plano_Comercializacao_RM_Lisura.docx
+++ b/Plano_Comercializacao_RM_Lisura.docx
@@ -627,7 +627,7 @@
                 <w:sz w:val="20"/>
                 <w:szCs w:val="20"/>
               </w:rPr>
-              <w:t xml:space="preserve">Paga por relatório, conforme o nível. Cortesia de 3 relatórios/mês para experimentar.</w:t>
+              <w:t>Paga por relatório, conforme o nível. Cortesia de 3 relatórios na entrada, uma única vez.</w:t>
             </w:r>
           </w:p>
         </w:tc>
@@ -888,7 +888,7 @@
         <w:spacing w:after="120"/>
       </w:pPr>
       <w:r>
-        <w:t xml:space="preserve">Controle já implementado no sistema: ao atingir o limite do plano, a geração é bloqueada com aviso ao usuário; o plano Avulso tem 3 relatórios de cortesia por mês; o painel do administrador mostra o uso e a cobrança sugerida de cada cliente.</w:t>
+        <w:t>Controle já implementado no sistema: ao atingir o limite do plano, a geração é bloqueada com aviso ao usuário; o plano Avulso concede 3 relatórios de cortesia uma única vez, na entrada; o painel do administrador mostra o uso e a cobrança sugerida de cada cliente.</w:t>
       </w:r>
     </w:p>
     <w:p>

</xml_diff>

<commit_message>
Precos: valor unico por nivel (50/90/180) e pacotes recalculados
</commit_message>
<xml_diff>
--- a/Plano_Comercializacao_RM_Lisura.docx
+++ b/Plano_Comercializacao_RM_Lisura.docx
@@ -47,7 +47,7 @@
           <w:sz w:val="20"/>
           <w:szCs w:val="20"/>
         </w:rPr>
-        <w:t xml:space="preserve">Documento de trabalho · Julho/2026 · Valores de exemplo a calibrar · Anexo à parceria com Daysival</w:t>
+        <w:t xml:space="preserve">Documento de trabalho · Julho/2026 · Anexo à parceria com Daysival</w:t>
       </w:r>
     </w:p>
     <w:p>
@@ -67,7 +67,7 @@
         <w:spacing w:after="120"/>
       </w:pPr>
       <w:r>
-        <w:t xml:space="preserve">O RM Lisura é uma plataforma web de auditoria e apoio à decisão em contratações públicas, baseada na Lei nº 14.133/2021, com 11 módulos que geram relatórios técnicos em PDF em minutos. O nome remete à lisura do certame — exatamente o que a ferramenta ajuda a garantir. A comercialização proposta cobra por relatório gerado, em três níveis conforme a complexidade e a consequência jurídica da análise, com pacotes mensais para quem usa com frequência. O custo de operação é baixo (IA por chamada + infraestrutura enxuta), o que permite margem alta mesmo nos preços de entrada, e escala sem contratação de equipe.</w:t>
+        <w:t xml:space="preserve">O RM Lisura é uma plataforma web de auditoria e apoio à decisão em contratações públicas, baseada na Lei nº 14.133/2021, com 11 módulos que geram relatórios técnicos em PDF em minutos. O nome remete à lisura do certame — exatamente o que a ferramenta ajuda a garantir. A comercialização proposta cobra por relatório gerado, em três níveis conforme a complexidade e a consequência jurídica da análise, com pacotes mensais para quem usa com frequência.</w:t>
       </w:r>
     </w:p>
     <w:p>
@@ -76,6 +76,14 @@
       </w:pPr>
       <w:r>
         <w:t xml:space="preserve">Marca depositada no INPI em 27/07/2026 (processo nº 944589618, classe NCL 42) e empresa constituída: RM Vértice Digital Inova Simples (I.S.), CNPJ 68.118.290/0001-06.</w:t>
+      </w:r>
+    </w:p>
+    <w:p>
+      <w:pPr>
+        <w:spacing w:after="120"/>
+      </w:pPr>
+      <w:r>
+        <w:t xml:space="preserve">Esta versão substitui a tabela enviada em 09/07/2026: os intervalos de preço foram substituídos por valor único por nível, para simplificar a cobrança e a comunicação com o cliente.</w:t>
       </w:r>
     </w:p>
     <w:p>
@@ -174,7 +182,7 @@
         <w:rPr>
           <w:color w:val="1A5C6E"/>
         </w:rPr>
-        <w:t xml:space="preserve">4. Modelo de cobrança — por relatório, em três níveis</w:t>
+        <w:t xml:space="preserve">4. Preço por relatório — três níveis</w:t>
       </w:r>
     </w:p>
     <w:p>
@@ -182,7 +190,7 @@
         <w:spacing w:after="120"/>
       </w:pPr>
       <w:r>
-        <w:t xml:space="preserve">Os 11 módulos têm pesos diferentes em esforço, profundidade e consequência da decisão que apoiam. Módulos de maior consequência custam mais — entregam mais valor e são candidatos a rodar em modelo de IA mais robusto, com maior custo de operação.</w:t>
+        <w:t xml:space="preserve">Os 11 módulos têm pesos diferentes em esforço, profundidade e consequência da decisão que apoiam. Módulos de maior consequência custam mais: entregam mais valor e são candidatos a rodar em modelo de IA mais robusto, com maior custo de operação.</w:t>
       </w:r>
     </w:p>
     <w:tbl>
@@ -268,7 +276,7 @@
                 <w:sz w:val="20"/>
                 <w:szCs w:val="20"/>
               </w:rPr>
-              <w:t xml:space="preserve">Preço/relatório (ex.)</w:t>
+              <w:t xml:space="preserve">Preço por relatório</w:t>
             </w:r>
           </w:p>
         </w:tc>
@@ -336,7 +344,7 @@
                 <w:sz w:val="20"/>
                 <w:szCs w:val="20"/>
               </w:rPr>
-              <w:t xml:space="preserve">R$ 30 a R$ 50</w:t>
+              <w:t xml:space="preserve">R$ 50</w:t>
             </w:r>
           </w:p>
         </w:tc>
@@ -404,7 +412,7 @@
                 <w:sz w:val="20"/>
                 <w:szCs w:val="20"/>
               </w:rPr>
-              <w:t xml:space="preserve">R$ 60 a R$ 90</w:t>
+              <w:t xml:space="preserve">R$ 90</w:t>
             </w:r>
           </w:p>
         </w:tc>
@@ -472,7 +480,7 @@
                 <w:sz w:val="20"/>
                 <w:szCs w:val="20"/>
               </w:rPr>
-              <w:t xml:space="preserve">R$ 120 a R$ 180</w:t>
+              <w:t xml:space="preserve">R$ 180</w:t>
             </w:r>
           </w:p>
         </w:tc>
@@ -581,7 +589,7 @@
                 <w:sz w:val="20"/>
                 <w:szCs w:val="20"/>
               </w:rPr>
-              <w:t xml:space="preserve">Valor (ex.)</w:t>
+              <w:t xml:space="preserve">Valor</w:t>
             </w:r>
           </w:p>
         </w:tc>
@@ -627,7 +635,7 @@
                 <w:sz w:val="20"/>
                 <w:szCs w:val="20"/>
               </w:rPr>
-              <w:t>Paga por relatório, conforme o nível. Cortesia de 3 relatórios na entrada, uma única vez.</w:t>
+              <w:t xml:space="preserve">Paga por relatório, conforme o nível. Cortesia de 3 relatórios na entrada, uma única vez.</w:t>
             </w:r>
           </w:p>
         </w:tc>
@@ -717,7 +725,7 @@
                 <w:sz w:val="20"/>
                 <w:szCs w:val="20"/>
               </w:rPr>
-              <w:t xml:space="preserve">R$ 900/mês</w:t>
+              <w:t xml:space="preserve">R$ 1.400/mês</w:t>
             </w:r>
           </w:p>
         </w:tc>
@@ -785,7 +793,7 @@
                 <w:sz w:val="20"/>
                 <w:szCs w:val="20"/>
               </w:rPr>
-              <w:t xml:space="preserve">R$ 1.900/mês</w:t>
+              <w:t xml:space="preserve">R$ 2.900/mês</w:t>
             </w:r>
           </w:p>
         </w:tc>
@@ -853,7 +861,7 @@
                 <w:sz w:val="20"/>
                 <w:szCs w:val="20"/>
               </w:rPr>
-              <w:t xml:space="preserve">R$ 3.500/mês</w:t>
+              <w:t xml:space="preserve">R$ 4.500/mês</w:t>
             </w:r>
           </w:p>
         </w:tc>
@@ -872,7 +880,7 @@
         <w:spacing w:after="120"/>
       </w:pPr>
       <w:r>
-        <w:t xml:space="preserve">Coerência dos pacotes: 20 relatórios avulsos a preço médio (~R$ 70) somam ~R$ 1.400 — o Básico a R$ 900 embute ~35% de desconto; o Profissional, ~45%. O Ilimitado funciona como teto para clientes de alto volume.</w:t>
+        <w:t xml:space="preserve">Coerência dos pacotes (preço médio por relatório: R$ 106,67): 20 relatórios avulsos somam R$ 2.133 — o Básico a R$ 1.400 embute 34% de desconto; o Profissional, 46%; o Ilimitado, 65% sobre a referência de uso justo. Em termos práticos, o Básico compensa a partir de 13 relatórios por mês, o Profissional a partir de 27 e o Ilimitado a partir de 42.</w:t>
       </w:r>
     </w:p>
     <w:p>
@@ -888,7 +896,7 @@
         <w:spacing w:after="120"/>
       </w:pPr>
       <w:r>
-        <w:t>Controle já implementado no sistema: ao atingir o limite do plano, a geração é bloqueada com aviso ao usuário; o plano Avulso concede 3 relatórios de cortesia uma única vez, na entrada; o painel do administrador mostra o uso e a cobrança sugerida de cada cliente.</w:t>
+        <w:t xml:space="preserve">Controle já implementado no sistema: ao atingir o limite do plano, a geração é bloqueada com aviso ao usuário; o plano Avulso concede 3 relatórios de cortesia uma única vez, na entrada; o painel do administrador mostra o uso e a cobrança sugerida de cada cliente.</w:t>
       </w:r>
     </w:p>
     <w:p>
@@ -900,7 +908,7 @@
         <w:rPr>
           <w:color w:val="1A5C6E"/>
         </w:rPr>
-        <w:t xml:space="preserve">5. Custo de operação e margem (estimativas a calibrar)</w:t>
+        <w:t xml:space="preserve">5. Custo de operação e margem</w:t>
       </w:r>
     </w:p>
     <w:p>
@@ -908,7 +916,7 @@
         <w:spacing w:after="120"/>
       </w:pPr>
       <w:r>
-        <w:t xml:space="preserve">O custo variável dominante é a chamada de IA. Nas condições atuais, o custo típico por relatório fica em centavos de real; se os módulos de nível Alto migrarem para um modelo mais forte, a estimativa é de R$ 2 a R$ 6 por relatório (a medir na prática). Custos fixos: hospedagem enxuta, banco de dados no plano gratuito e domínio. Mesmo no cenário conservador, a margem bruta por relatório supera 90% no nível Alto e 95% nos demais.</w:t>
+        <w:t xml:space="preserve">O custo variável dominante é a chamada de IA. Nas condições atuais, o custo típico por relatório fica em centavos de real; se os módulos de nível Alto migrarem para um modelo mais forte, a estimativa é de R$ 2 a R$ 6 por relatório (a medir na prática). Custos fixos: hospedagem enxuta, banco de dados no plano gratuito e domínio. A margem bruta por relatório supera 95% em todos os níveis.</w:t>
       </w:r>
     </w:p>
     <w:p>
@@ -928,7 +936,7 @@
         <w:spacing w:after="120"/>
       </w:pPr>
       <w:r>
-        <w:t xml:space="preserve">Esta tabela corresponde ao Item II da contraproposta de Daysival (cobrança pelo uso das análises). Pontos a formalizar: percentual de divisão da receita entre RM Vértice Digital (produto/tecnologia) e Daysival (canal comercial/jurídico), responsabilidades de suporte ao cliente, titularidade da marca e da carteira de clientes, e regra de saída. A marca RM Lisura pertence à RM Vértice Digital (depósito no INPI em nome do sócio, com cessão à empresa em andamento).</w:t>
+        <w:t xml:space="preserve">Esta tabela corresponde ao Item II da contraproposta de Daysival (cobrança pelo uso das análises). Pontos a formalizar: percentual de divisão da receita entre RM Vértice Digital (produto/tecnologia) e Daysival (canal comercial/jurídico), prazo das comissões de indicação, responsabilidades de suporte ao cliente, titularidade da marca e da carteira de clientes, e regra de saída. A marca RM Lisura pertence à RM Vértice Digital (depósito em nome do sócio, com cessão à empresa em andamento).</w:t>
       </w:r>
     </w:p>
     <w:p>
@@ -1287,7 +1295,7 @@
         <w:spacing w:after="80"/>
       </w:pPr>
       <w:r>
-        <w:t xml:space="preserve">Mês 3–4: converter 3 pilotos em pagantes (mix avulso/Básico); receita alvo R$ 2.000–3.000/mês.</w:t>
+        <w:t xml:space="preserve">Mês 3–4: converter 3 pilotos em pagantes (mix avulso/Básico); receita alvo R$ 3.000–4.000/mês.</w:t>
       </w:r>
     </w:p>
     <w:p>
@@ -1300,7 +1308,7 @@
         <w:spacing w:after="80"/>
       </w:pPr>
       <w:r>
-        <w:t xml:space="preserve">Mês 5–6: 6 a 10 clientes ativos; receita alvo R$ 5.000–8.000/mês; decidir investimento na Fase 3.</w:t>
+        <w:t xml:space="preserve">Mês 5–6: 6 a 10 clientes ativos; receita alvo R$ 8.000–12.000/mês; decidir investimento na Fase 3.</w:t>
       </w:r>
     </w:p>
     <w:p>
@@ -1364,7 +1372,7 @@
         <w:spacing w:after="80"/>
       </w:pPr>
       <w:r>
-        <w:t xml:space="preserve">Concorrência de plataformas grandes → foco em nicho (municípios pequenos + canal jurídico), preço acessível e atuação nas fases que os concorrentes não cobrem.</w:t>
+        <w:t xml:space="preserve">Concorrência de plataformas grandes → foco em nicho (municípios pequenos + canal jurídico) e atuação nas fases que os concorrentes não cobrem.</w:t>
       </w:r>
     </w:p>
     <w:p>

</xml_diff>

<commit_message>
Precos revistos (90/190/380), uso justo 60 e servicos extras
</commit_message>
<xml_diff>
--- a/Plano_Comercializacao_RM_Lisura.docx
+++ b/Plano_Comercializacao_RM_Lisura.docx
@@ -47,7 +47,7 @@
           <w:sz w:val="20"/>
           <w:szCs w:val="20"/>
         </w:rPr>
-        <w:t xml:space="preserve">Documento de trabalho · </w:t>
+        <w:t xml:space="preserve">Versão 2 · </w:t>
       </w:r>
       <w:proofErr w:type="gramStart"/>
       <w:r>
@@ -69,13 +69,14 @@
           <w:sz w:val="20"/>
           <w:szCs w:val="20"/>
         </w:rPr>
-        <w:t>/2026 · Anexo à parceria com Daysival</w:t>
+        <w:t>/2026 · Substitui a tabela de 09/07 e a versão de 28/07</w:t>
       </w:r>
     </w:p>
     <w:p>
       <w:pPr>
         <w:pStyle w:val="Ttulo1"/>
-        <w:spacing w:before="280" w:after="120"/>
+        <w:spacing w:before="260" w:after="110"/>
+        <w:jc w:val="both"/>
       </w:pPr>
       <w:r>
         <w:rPr>
@@ -90,7 +91,7 @@
         <w:jc w:val="both"/>
       </w:pPr>
       <w:r>
-        <w:t>O RM Lisura é uma plataforma web de auditoria e apoio à decisão em contratações públicas, baseada na Lei nº 14.133/2021, com 11 módulos que geram relatórios técnicos em PDF em minutos. O nome remete à lisura do certame — exatamente o que a ferramenta ajuda a garantir. A comercialização proposta cobra por relatório gerado, em três níveis conforme a complexidade e a consequência jurídica da análise, com pacotes mensais para quem usa com frequência.</w:t>
+        <w:t>O RM Lisura é uma plataforma web de auditoria e apoio à decisão em contratações públicas, baseada na Lei nº 14.133/2021, com 12 módulos que geram relatórios técnicos em PDF em minutos. O nome remete à lisura do certame — exatamente o que a ferramenta ajuda a garantir.</w:t>
       </w:r>
     </w:p>
     <w:p>
@@ -99,7 +100,7 @@
         <w:jc w:val="both"/>
       </w:pPr>
       <w:r>
-        <w:t>Marca depositada no INPI em 27/07/2026 (processo nº 944589618, classe NCL 42) e empresa constituída: RM Vértice Digital Inova Simples (I.S.), CNPJ 68.118.290/0001-06.</w:t>
+        <w:t>Marca depositada no INPI em 27/07/2026 (processo nº 944589618, classe NCL 42). Empresa constituída: RM Vértice Digital Inova Simples (I.S.), CNPJ 68.118.290/0001-06.</w:t>
       </w:r>
     </w:p>
     <w:p>
@@ -108,13 +109,14 @@
         <w:jc w:val="both"/>
       </w:pPr>
       <w:r>
-        <w:t>Esta versão substitui a tabela enviada em 09/07/2026: os intervalos de preço foram substituídos por valor único por nível, para simplificar a cobrança e a comunicação com o cliente.</w:t>
+        <w:t>Esta versão revisa os preços para cima. A revisão nasceu de uma observação do parceiro jurídico: no setor público, preço baixo demais sinaliza ferramenta amadora e não cobre os pedidos fora do escopo que inevitavelmente surgem. Em contrapartida, o documento passa a trazer o que faltava — regras claras de escopo e uma tabela de serviços extras.</w:t>
       </w:r>
     </w:p>
     <w:p>
       <w:pPr>
         <w:pStyle w:val="Ttulo1"/>
-        <w:spacing w:before="280" w:after="120"/>
+        <w:spacing w:before="260" w:after="110"/>
+        <w:jc w:val="both"/>
       </w:pPr>
       <w:r>
         <w:rPr>
@@ -129,11 +131,11 @@
         <w:jc w:val="both"/>
       </w:pPr>
       <w:r>
-        <w:t xml:space="preserve">Ferramenta de apoio — não substitui o parecer jurídico (aviso presente em todos os relatórios). Módulos: Auditoria de Edital, Auditoria de TR, Auditoria de ETP, </w:t>
+        <w:t>Ferramenta de apoio — não substitui o parecer jurídico (aviso presente em todos os relatórios). Doze módulos cobrem quatro momentos da contratação: fase preparatória (ETP, TR, pesquisa de preços, edital), habilitação e integridade do licitante (</w:t>
       </w:r>
       <w:proofErr w:type="spellStart"/>
       <w:r>
-        <w:t>Due</w:t>
+        <w:t>due</w:t>
       </w:r>
       <w:proofErr w:type="spellEnd"/>
       <w:r>
@@ -141,11 +143,11 @@
       </w:r>
       <w:proofErr w:type="spellStart"/>
       <w:r>
-        <w:t>Diligence</w:t>
+        <w:t>diligence</w:t>
       </w:r>
       <w:proofErr w:type="spellEnd"/>
       <w:r>
-        <w:t xml:space="preserve"> de Integridade (DDI), Diagnóstico de Integridade, Avaliação de Programa de Integridade, Alterações Contratuais, Monitor de Recebimento, Dosimetria de Sanções, Reabilitação de Fornecedor, Instituto da Diligência e Pesquisa de Mercado com preços reais do PNCP (IN SEGES/MGI 65/2021).</w:t>
+        <w:t>, avaliação de programa de integridade, instituto da diligência), execução contratual (alterações, recebimento) e sanção/defesa (dosimetria, reabilitação), além do diagnóstico de integridade do próprio órgão.</w:t>
       </w:r>
     </w:p>
     <w:p>
@@ -154,7 +156,7 @@
         <w:jc w:val="both"/>
       </w:pPr>
       <w:r>
-        <w:t>Diferenciais: fundamentação legal citada artigo por artigo em cada apontamento; índice de risco objetivo; pesquisa de preços com fonte oficial (PNCP); relatórios prontos para juntar ao processo administrativo.</w:t>
+        <w:t>Posicionamento: enquanto plataformas concorrentes ajudam o órgão a ELABORAR os documentos da fase preparatória, o RM Lisura AUDITA o que já está pronto e atua também nas fases de execução, sanção e defesa — papéis complementares, público diferente.</w:t>
       </w:r>
     </w:p>
     <w:p>
@@ -163,13 +165,14 @@
         <w:jc w:val="both"/>
       </w:pPr>
       <w:r>
-        <w:t>Posicionamento: enquanto plataformas concorrentes ajudam o órgão a ELABORAR os documentos da fase preparatória, o RM Lisura AUDITA o que já está pronto e atua também nas fases de execução, sanção e defesa — papéis complementares, público diferente.</w:t>
+        <w:t>Diferencial de confiabilidade: o sistema distingue o que verificou do que não verificou. Quando uma base pública não responde ou o formulário não é preenchido, o relatório registra "verificação pendente" ou "não avaliado" em vez de presumir conformidade — o oposto do que faz uma ferramenta que apenas preenche lacunas.</w:t>
       </w:r>
     </w:p>
     <w:p>
       <w:pPr>
         <w:pStyle w:val="Ttulo1"/>
-        <w:spacing w:before="280" w:after="120"/>
+        <w:spacing w:before="260" w:after="110"/>
+        <w:jc w:val="both"/>
       </w:pPr>
       <w:r>
         <w:rPr>
@@ -189,7 +192,7 @@
         <w:jc w:val="both"/>
       </w:pPr>
       <w:r>
-        <w:t>Assessorias e escritórios jurídicos que atendem prefeituras e câmaras municipais (canal principal — parceria Daysival).</w:t>
+        <w:t>Assessorias e escritórios jurídicos que atendem prefeituras e câmaras municipais (canal principal da parceria).</w:t>
       </w:r>
     </w:p>
     <w:p>
@@ -223,13 +226,14 @@
     <w:p>
       <w:pPr>
         <w:pStyle w:val="Ttulo1"/>
-        <w:spacing w:before="280" w:after="120"/>
+        <w:spacing w:before="260" w:after="110"/>
+        <w:jc w:val="both"/>
       </w:pPr>
       <w:r>
         <w:rPr>
           <w:color w:val="1A5C6E"/>
         </w:rPr>
-        <w:t>4. Preço por relatório — três níveis</w:t>
+        <w:t>4. Preço por relatório</w:t>
       </w:r>
     </w:p>
     <w:p>
@@ -238,12 +242,12 @@
         <w:jc w:val="both"/>
       </w:pPr>
       <w:r>
-        <w:t>Os 11 módulos têm pesos diferentes em esforço, profundidade e consequência da decisão que apoiam. Módulos de maior consequência custam mais: entregam mais valor e são candidatos a rodar em modelo de IA mais robusto, com maior custo de operação.</w:t>
+        <w:t>Três níveis, conforme a complexidade da análise e a consequência jurídica da decisão que ela apoia. A referência de valor não é o custo de processamento, e sim o custo do erro que a análise evita: um edital anulado custa meses ao órgão e pode gerar responsabilização pessoal do gestor.</w:t>
       </w:r>
     </w:p>
     <w:tbl>
       <w:tblPr>
-        <w:tblW w:w="0" w:type="auto"/>
+        <w:tblW w:w="8800" w:type="dxa"/>
         <w:jc w:val="center"/>
         <w:tblBorders>
           <w:top w:val="single" w:sz="4" w:space="0" w:color="auto"/>
@@ -260,9 +264,9 @@
         <w:tblLook w:val="0000" w:firstRow="0" w:lastRow="0" w:firstColumn="0" w:lastColumn="0" w:noHBand="0" w:noVBand="0"/>
       </w:tblPr>
       <w:tblGrid>
-        <w:gridCol w:w="827"/>
-        <w:gridCol w:w="5972"/>
-        <w:gridCol w:w="1843"/>
+        <w:gridCol w:w="1300"/>
+        <w:gridCol w:w="5200"/>
+        <w:gridCol w:w="2300"/>
       </w:tblGrid>
       <w:tr>
         <w:tblPrEx>
@@ -276,7 +280,7 @@
         </w:trPr>
         <w:tc>
           <w:tcPr>
-            <w:tcW w:w="0" w:type="auto"/>
+            <w:tcW w:w="1300" w:type="dxa"/>
             <w:shd w:val="clear" w:color="auto" w:fill="F2F2F2"/>
             <w:tcMar>
               <w:top w:w="60" w:type="dxa"/>
@@ -284,7 +288,6 @@
               <w:bottom w:w="60" w:type="dxa"/>
               <w:right w:w="100" w:type="dxa"/>
             </w:tcMar>
-            <w:vAlign w:val="center"/>
           </w:tcPr>
           <w:p>
             <w:pPr>
@@ -303,7 +306,7 @@
         </w:tc>
         <w:tc>
           <w:tcPr>
-            <w:tcW w:w="5972" w:type="dxa"/>
+            <w:tcW w:w="5200" w:type="dxa"/>
             <w:shd w:val="clear" w:color="auto" w:fill="F2F2F2"/>
             <w:tcMar>
               <w:top w:w="60" w:type="dxa"/>
@@ -311,7 +314,6 @@
               <w:bottom w:w="60" w:type="dxa"/>
               <w:right w:w="100" w:type="dxa"/>
             </w:tcMar>
-            <w:vAlign w:val="center"/>
           </w:tcPr>
           <w:p>
             <w:pPr>
@@ -330,7 +332,7 @@
         </w:tc>
         <w:tc>
           <w:tcPr>
-            <w:tcW w:w="1843" w:type="dxa"/>
+            <w:tcW w:w="2300" w:type="dxa"/>
             <w:shd w:val="clear" w:color="auto" w:fill="F2F2F2"/>
             <w:tcMar>
               <w:top w:w="60" w:type="dxa"/>
@@ -338,7 +340,6 @@
               <w:bottom w:w="60" w:type="dxa"/>
               <w:right w:w="100" w:type="dxa"/>
             </w:tcMar>
-            <w:vAlign w:val="center"/>
           </w:tcPr>
           <w:p>
             <w:pPr>
@@ -368,14 +369,13 @@
         </w:trPr>
         <w:tc>
           <w:tcPr>
-            <w:tcW w:w="0" w:type="auto"/>
-            <w:tcMar>
-              <w:top w:w="60" w:type="dxa"/>
-              <w:left w:w="100" w:type="dxa"/>
-              <w:bottom w:w="60" w:type="dxa"/>
-              <w:right w:w="100" w:type="dxa"/>
-            </w:tcMar>
-            <w:vAlign w:val="center"/>
+            <w:tcW w:w="1300" w:type="dxa"/>
+            <w:tcMar>
+              <w:top w:w="60" w:type="dxa"/>
+              <w:left w:w="100" w:type="dxa"/>
+              <w:bottom w:w="60" w:type="dxa"/>
+              <w:right w:w="100" w:type="dxa"/>
+            </w:tcMar>
           </w:tcPr>
           <w:p>
             <w:r>
@@ -389,35 +389,65 @@
         </w:tc>
         <w:tc>
           <w:tcPr>
-            <w:tcW w:w="5972" w:type="dxa"/>
-            <w:tcMar>
-              <w:top w:w="60" w:type="dxa"/>
-              <w:left w:w="100" w:type="dxa"/>
-              <w:bottom w:w="60" w:type="dxa"/>
-              <w:right w:w="100" w:type="dxa"/>
-            </w:tcMar>
-            <w:vAlign w:val="center"/>
-          </w:tcPr>
-          <w:p>
-            <w:r>
-              <w:rPr>
-                <w:sz w:val="20"/>
-                <w:szCs w:val="20"/>
-              </w:rPr>
-              <w:t>Recebimento; Reabilitação de Fornecedor; Instituto da Diligência; DDI.</w:t>
-            </w:r>
-          </w:p>
-        </w:tc>
-        <w:tc>
-          <w:tcPr>
-            <w:tcW w:w="1843" w:type="dxa"/>
-            <w:tcMar>
-              <w:top w:w="60" w:type="dxa"/>
-              <w:left w:w="100" w:type="dxa"/>
-              <w:bottom w:w="60" w:type="dxa"/>
-              <w:right w:w="100" w:type="dxa"/>
-            </w:tcMar>
-            <w:vAlign w:val="center"/>
+            <w:tcW w:w="5200" w:type="dxa"/>
+            <w:tcMar>
+              <w:top w:w="60" w:type="dxa"/>
+              <w:left w:w="100" w:type="dxa"/>
+              <w:bottom w:w="60" w:type="dxa"/>
+              <w:right w:w="100" w:type="dxa"/>
+            </w:tcMar>
+          </w:tcPr>
+          <w:p>
+            <w:r>
+              <w:rPr>
+                <w:sz w:val="20"/>
+                <w:szCs w:val="20"/>
+              </w:rPr>
+              <w:t xml:space="preserve">Recebimento; Reabilitação de Fornecedor; Instituto da Diligência; </w:t>
+            </w:r>
+            <w:proofErr w:type="spellStart"/>
+            <w:r>
+              <w:rPr>
+                <w:sz w:val="20"/>
+                <w:szCs w:val="20"/>
+              </w:rPr>
+              <w:t>Due</w:t>
+            </w:r>
+            <w:proofErr w:type="spellEnd"/>
+            <w:r>
+              <w:rPr>
+                <w:sz w:val="20"/>
+                <w:szCs w:val="20"/>
+              </w:rPr>
+              <w:t xml:space="preserve"> </w:t>
+            </w:r>
+            <w:proofErr w:type="spellStart"/>
+            <w:r>
+              <w:rPr>
+                <w:sz w:val="20"/>
+                <w:szCs w:val="20"/>
+              </w:rPr>
+              <w:t>Diligence</w:t>
+            </w:r>
+            <w:proofErr w:type="spellEnd"/>
+            <w:r>
+              <w:rPr>
+                <w:sz w:val="20"/>
+                <w:szCs w:val="20"/>
+              </w:rPr>
+              <w:t xml:space="preserve"> de Integridade.</w:t>
+            </w:r>
+          </w:p>
+        </w:tc>
+        <w:tc>
+          <w:tcPr>
+            <w:tcW w:w="2300" w:type="dxa"/>
+            <w:tcMar>
+              <w:top w:w="60" w:type="dxa"/>
+              <w:left w:w="100" w:type="dxa"/>
+              <w:bottom w:w="60" w:type="dxa"/>
+              <w:right w:w="100" w:type="dxa"/>
+            </w:tcMar>
           </w:tcPr>
           <w:p>
             <w:pPr>
@@ -428,7 +458,7 @@
                 <w:sz w:val="20"/>
                 <w:szCs w:val="20"/>
               </w:rPr>
-              <w:t>R$ 50</w:t>
+              <w:t>R$ 90</w:t>
             </w:r>
             <w:r>
               <w:rPr>
@@ -452,14 +482,13 @@
         </w:trPr>
         <w:tc>
           <w:tcPr>
-            <w:tcW w:w="0" w:type="auto"/>
-            <w:tcMar>
-              <w:top w:w="60" w:type="dxa"/>
-              <w:left w:w="100" w:type="dxa"/>
-              <w:bottom w:w="60" w:type="dxa"/>
-              <w:right w:w="100" w:type="dxa"/>
-            </w:tcMar>
-            <w:vAlign w:val="center"/>
+            <w:tcW w:w="1300" w:type="dxa"/>
+            <w:tcMar>
+              <w:top w:w="60" w:type="dxa"/>
+              <w:left w:w="100" w:type="dxa"/>
+              <w:bottom w:w="60" w:type="dxa"/>
+              <w:right w:w="100" w:type="dxa"/>
+            </w:tcMar>
           </w:tcPr>
           <w:p>
             <w:r>
@@ -473,14 +502,13 @@
         </w:tc>
         <w:tc>
           <w:tcPr>
-            <w:tcW w:w="5972" w:type="dxa"/>
-            <w:tcMar>
-              <w:top w:w="60" w:type="dxa"/>
-              <w:left w:w="100" w:type="dxa"/>
-              <w:bottom w:w="60" w:type="dxa"/>
-              <w:right w:w="100" w:type="dxa"/>
-            </w:tcMar>
-            <w:vAlign w:val="center"/>
+            <w:tcW w:w="5200" w:type="dxa"/>
+            <w:tcMar>
+              <w:top w:w="60" w:type="dxa"/>
+              <w:left w:w="100" w:type="dxa"/>
+              <w:bottom w:w="60" w:type="dxa"/>
+              <w:right w:w="100" w:type="dxa"/>
+            </w:tcMar>
           </w:tcPr>
           <w:p>
             <w:r>
@@ -494,14 +522,13 @@
         </w:tc>
         <w:tc>
           <w:tcPr>
-            <w:tcW w:w="1843" w:type="dxa"/>
-            <w:tcMar>
-              <w:top w:w="60" w:type="dxa"/>
-              <w:left w:w="100" w:type="dxa"/>
-              <w:bottom w:w="60" w:type="dxa"/>
-              <w:right w:w="100" w:type="dxa"/>
-            </w:tcMar>
-            <w:vAlign w:val="center"/>
+            <w:tcW w:w="2300" w:type="dxa"/>
+            <w:tcMar>
+              <w:top w:w="60" w:type="dxa"/>
+              <w:left w:w="100" w:type="dxa"/>
+              <w:bottom w:w="60" w:type="dxa"/>
+              <w:right w:w="100" w:type="dxa"/>
+            </w:tcMar>
           </w:tcPr>
           <w:p>
             <w:pPr>
@@ -512,7 +539,7 @@
                 <w:sz w:val="20"/>
                 <w:szCs w:val="20"/>
               </w:rPr>
-              <w:t>R$ 90</w:t>
+              <w:t>R$ 190</w:t>
             </w:r>
             <w:r>
               <w:rPr>
@@ -536,35 +563,34 @@
         </w:trPr>
         <w:tc>
           <w:tcPr>
-            <w:tcW w:w="0" w:type="auto"/>
-            <w:tcMar>
-              <w:top w:w="60" w:type="dxa"/>
-              <w:left w:w="100" w:type="dxa"/>
-              <w:bottom w:w="60" w:type="dxa"/>
-              <w:right w:w="100" w:type="dxa"/>
-            </w:tcMar>
-            <w:vAlign w:val="center"/>
-          </w:tcPr>
-          <w:p>
-            <w:r>
-              <w:rPr>
-                <w:sz w:val="20"/>
-                <w:szCs w:val="20"/>
-              </w:rPr>
+            <w:tcW w:w="1300" w:type="dxa"/>
+            <w:tcMar>
+              <w:top w:w="60" w:type="dxa"/>
+              <w:left w:w="100" w:type="dxa"/>
+              <w:bottom w:w="60" w:type="dxa"/>
+              <w:right w:w="100" w:type="dxa"/>
+            </w:tcMar>
+          </w:tcPr>
+          <w:p>
+            <w:r>
+              <w:rPr>
+                <w:sz w:val="20"/>
+                <w:szCs w:val="20"/>
+              </w:rPr>
+              <w:lastRenderedPageBreak/>
               <w:t>Alto</w:t>
             </w:r>
           </w:p>
         </w:tc>
         <w:tc>
           <w:tcPr>
-            <w:tcW w:w="5972" w:type="dxa"/>
-            <w:tcMar>
-              <w:top w:w="60" w:type="dxa"/>
-              <w:left w:w="100" w:type="dxa"/>
-              <w:bottom w:w="60" w:type="dxa"/>
-              <w:right w:w="100" w:type="dxa"/>
-            </w:tcMar>
-            <w:vAlign w:val="center"/>
+            <w:tcW w:w="5200" w:type="dxa"/>
+            <w:tcMar>
+              <w:top w:w="60" w:type="dxa"/>
+              <w:left w:w="100" w:type="dxa"/>
+              <w:bottom w:w="60" w:type="dxa"/>
+              <w:right w:w="100" w:type="dxa"/>
+            </w:tcMar>
           </w:tcPr>
           <w:p>
             <w:r>
@@ -578,14 +604,13 @@
         </w:tc>
         <w:tc>
           <w:tcPr>
-            <w:tcW w:w="1843" w:type="dxa"/>
-            <w:tcMar>
-              <w:top w:w="60" w:type="dxa"/>
-              <w:left w:w="100" w:type="dxa"/>
-              <w:bottom w:w="60" w:type="dxa"/>
-              <w:right w:w="100" w:type="dxa"/>
-            </w:tcMar>
-            <w:vAlign w:val="center"/>
+            <w:tcW w:w="2300" w:type="dxa"/>
+            <w:tcMar>
+              <w:top w:w="60" w:type="dxa"/>
+              <w:left w:w="100" w:type="dxa"/>
+              <w:bottom w:w="60" w:type="dxa"/>
+              <w:right w:w="100" w:type="dxa"/>
+            </w:tcMar>
           </w:tcPr>
           <w:p>
             <w:pPr>
@@ -596,7 +621,7 @@
                 <w:sz w:val="20"/>
                 <w:szCs w:val="20"/>
               </w:rPr>
-              <w:t>R$ 180</w:t>
+              <w:t>R$ 380</w:t>
             </w:r>
             <w:r>
               <w:rPr>
@@ -617,18 +642,18 @@
     <w:p>
       <w:pPr>
         <w:pStyle w:val="Ttulo2"/>
-        <w:spacing w:before="220" w:after="100"/>
+        <w:spacing w:before="200" w:after="90"/>
       </w:pPr>
       <w:r>
         <w:rPr>
           <w:color w:val="1A5C6E"/>
         </w:rPr>
-        <w:t>Pacotes mensais (previsibilidade)</w:t>
+        <w:t>Pacotes mensais</w:t>
       </w:r>
     </w:p>
     <w:tbl>
       <w:tblPr>
-        <w:tblW w:w="0" w:type="auto"/>
+        <w:tblW w:w="8800" w:type="dxa"/>
         <w:jc w:val="center"/>
         <w:tblBorders>
           <w:top w:val="single" w:sz="4" w:space="0" w:color="auto"/>
@@ -645,9 +670,9 @@
         <w:tblLook w:val="0000" w:firstRow="0" w:lastRow="0" w:firstColumn="0" w:lastColumn="0" w:noHBand="0" w:noVBand="0"/>
       </w:tblPr>
       <w:tblGrid>
-        <w:gridCol w:w="1141"/>
-        <w:gridCol w:w="4241"/>
-        <w:gridCol w:w="1843"/>
+        <w:gridCol w:w="2000"/>
+        <w:gridCol w:w="4500"/>
+        <w:gridCol w:w="2300"/>
       </w:tblGrid>
       <w:tr>
         <w:tblPrEx>
@@ -661,7 +686,7 @@
         </w:trPr>
         <w:tc>
           <w:tcPr>
-            <w:tcW w:w="0" w:type="auto"/>
+            <w:tcW w:w="2000" w:type="dxa"/>
             <w:shd w:val="clear" w:color="auto" w:fill="F2F2F2"/>
             <w:tcMar>
               <w:top w:w="60" w:type="dxa"/>
@@ -669,12 +694,8 @@
               <w:bottom w:w="60" w:type="dxa"/>
               <w:right w:w="100" w:type="dxa"/>
             </w:tcMar>
-            <w:vAlign w:val="center"/>
-          </w:tcPr>
-          <w:p>
-            <w:pPr>
-              <w:jc w:val="center"/>
-            </w:pPr>
+          </w:tcPr>
+          <w:p>
             <w:r>
               <w:rPr>
                 <w:b/>
@@ -688,7 +709,7 @@
         </w:tc>
         <w:tc>
           <w:tcPr>
-            <w:tcW w:w="4241" w:type="dxa"/>
+            <w:tcW w:w="4500" w:type="dxa"/>
             <w:shd w:val="clear" w:color="auto" w:fill="F2F2F2"/>
             <w:tcMar>
               <w:top w:w="60" w:type="dxa"/>
@@ -696,12 +717,8 @@
               <w:bottom w:w="60" w:type="dxa"/>
               <w:right w:w="100" w:type="dxa"/>
             </w:tcMar>
-            <w:vAlign w:val="center"/>
-          </w:tcPr>
-          <w:p>
-            <w:pPr>
-              <w:jc w:val="center"/>
-            </w:pPr>
+          </w:tcPr>
+          <w:p>
             <w:r>
               <w:rPr>
                 <w:b/>
@@ -715,7 +732,7 @@
         </w:tc>
         <w:tc>
           <w:tcPr>
-            <w:tcW w:w="1843" w:type="dxa"/>
+            <w:tcW w:w="2300" w:type="dxa"/>
             <w:shd w:val="clear" w:color="auto" w:fill="F2F2F2"/>
             <w:tcMar>
               <w:top w:w="60" w:type="dxa"/>
@@ -723,12 +740,8 @@
               <w:bottom w:w="60" w:type="dxa"/>
               <w:right w:w="100" w:type="dxa"/>
             </w:tcMar>
-            <w:vAlign w:val="center"/>
-          </w:tcPr>
-          <w:p>
-            <w:pPr>
-              <w:jc w:val="center"/>
-            </w:pPr>
+          </w:tcPr>
+          <w:p>
             <w:r>
               <w:rPr>
                 <w:b/>
@@ -753,14 +766,13 @@
         </w:trPr>
         <w:tc>
           <w:tcPr>
-            <w:tcW w:w="0" w:type="auto"/>
-            <w:tcMar>
-              <w:top w:w="60" w:type="dxa"/>
-              <w:left w:w="100" w:type="dxa"/>
-              <w:bottom w:w="60" w:type="dxa"/>
-              <w:right w:w="100" w:type="dxa"/>
-            </w:tcMar>
-            <w:vAlign w:val="center"/>
+            <w:tcW w:w="2000" w:type="dxa"/>
+            <w:tcMar>
+              <w:top w:w="60" w:type="dxa"/>
+              <w:left w:w="100" w:type="dxa"/>
+              <w:bottom w:w="60" w:type="dxa"/>
+              <w:right w:w="100" w:type="dxa"/>
+            </w:tcMar>
           </w:tcPr>
           <w:p>
             <w:r>
@@ -774,14 +786,13 @@
         </w:tc>
         <w:tc>
           <w:tcPr>
-            <w:tcW w:w="4241" w:type="dxa"/>
-            <w:tcMar>
-              <w:top w:w="60" w:type="dxa"/>
-              <w:left w:w="100" w:type="dxa"/>
-              <w:bottom w:w="60" w:type="dxa"/>
-              <w:right w:w="100" w:type="dxa"/>
-            </w:tcMar>
-            <w:vAlign w:val="center"/>
+            <w:tcW w:w="4500" w:type="dxa"/>
+            <w:tcMar>
+              <w:top w:w="60" w:type="dxa"/>
+              <w:left w:w="100" w:type="dxa"/>
+              <w:bottom w:w="60" w:type="dxa"/>
+              <w:right w:w="100" w:type="dxa"/>
+            </w:tcMar>
           </w:tcPr>
           <w:p>
             <w:r>
@@ -795,14 +806,13 @@
         </w:tc>
         <w:tc>
           <w:tcPr>
-            <w:tcW w:w="1843" w:type="dxa"/>
-            <w:tcMar>
-              <w:top w:w="60" w:type="dxa"/>
-              <w:left w:w="100" w:type="dxa"/>
-              <w:bottom w:w="60" w:type="dxa"/>
-              <w:right w:w="100" w:type="dxa"/>
-            </w:tcMar>
-            <w:vAlign w:val="center"/>
+            <w:tcW w:w="2300" w:type="dxa"/>
+            <w:tcMar>
+              <w:top w:w="60" w:type="dxa"/>
+              <w:left w:w="100" w:type="dxa"/>
+              <w:bottom w:w="60" w:type="dxa"/>
+              <w:right w:w="100" w:type="dxa"/>
+            </w:tcMar>
           </w:tcPr>
           <w:p>
             <w:pPr>
@@ -813,7 +823,14 @@
                 <w:sz w:val="20"/>
                 <w:szCs w:val="20"/>
               </w:rPr>
-              <w:t>Sem mensalidade</w:t>
+              <w:t>s</w:t>
+            </w:r>
+            <w:r>
+              <w:rPr>
+                <w:sz w:val="20"/>
+                <w:szCs w:val="20"/>
+              </w:rPr>
+              <w:t>em mensalidade</w:t>
             </w:r>
           </w:p>
         </w:tc>
@@ -830,14 +847,13 @@
         </w:trPr>
         <w:tc>
           <w:tcPr>
-            <w:tcW w:w="0" w:type="auto"/>
-            <w:tcMar>
-              <w:top w:w="60" w:type="dxa"/>
-              <w:left w:w="100" w:type="dxa"/>
-              <w:bottom w:w="60" w:type="dxa"/>
-              <w:right w:w="100" w:type="dxa"/>
-            </w:tcMar>
-            <w:vAlign w:val="center"/>
+            <w:tcW w:w="2000" w:type="dxa"/>
+            <w:tcMar>
+              <w:top w:w="60" w:type="dxa"/>
+              <w:left w:w="100" w:type="dxa"/>
+              <w:bottom w:w="60" w:type="dxa"/>
+              <w:right w:w="100" w:type="dxa"/>
+            </w:tcMar>
           </w:tcPr>
           <w:p>
             <w:r>
@@ -851,14 +867,13 @@
         </w:tc>
         <w:tc>
           <w:tcPr>
-            <w:tcW w:w="4241" w:type="dxa"/>
-            <w:tcMar>
-              <w:top w:w="60" w:type="dxa"/>
-              <w:left w:w="100" w:type="dxa"/>
-              <w:bottom w:w="60" w:type="dxa"/>
-              <w:right w:w="100" w:type="dxa"/>
-            </w:tcMar>
-            <w:vAlign w:val="center"/>
+            <w:tcW w:w="4500" w:type="dxa"/>
+            <w:tcMar>
+              <w:top w:w="60" w:type="dxa"/>
+              <w:left w:w="100" w:type="dxa"/>
+              <w:bottom w:w="60" w:type="dxa"/>
+              <w:right w:w="100" w:type="dxa"/>
+            </w:tcMar>
           </w:tcPr>
           <w:p>
             <w:r>
@@ -872,14 +887,13 @@
         </w:tc>
         <w:tc>
           <w:tcPr>
-            <w:tcW w:w="1843" w:type="dxa"/>
-            <w:tcMar>
-              <w:top w:w="60" w:type="dxa"/>
-              <w:left w:w="100" w:type="dxa"/>
-              <w:bottom w:w="60" w:type="dxa"/>
-              <w:right w:w="100" w:type="dxa"/>
-            </w:tcMar>
-            <w:vAlign w:val="center"/>
+            <w:tcW w:w="2300" w:type="dxa"/>
+            <w:tcMar>
+              <w:top w:w="60" w:type="dxa"/>
+              <w:left w:w="100" w:type="dxa"/>
+              <w:bottom w:w="60" w:type="dxa"/>
+              <w:right w:w="100" w:type="dxa"/>
+            </w:tcMar>
           </w:tcPr>
           <w:p>
             <w:pPr>
@@ -890,7 +904,7 @@
                 <w:sz w:val="20"/>
                 <w:szCs w:val="20"/>
               </w:rPr>
-              <w:t>R$ 1.400</w:t>
+              <w:t>R$ 2.500</w:t>
             </w:r>
             <w:r>
               <w:rPr>
@@ -921,14 +935,13 @@
         </w:trPr>
         <w:tc>
           <w:tcPr>
-            <w:tcW w:w="0" w:type="auto"/>
-            <w:tcMar>
-              <w:top w:w="60" w:type="dxa"/>
-              <w:left w:w="100" w:type="dxa"/>
-              <w:bottom w:w="60" w:type="dxa"/>
-              <w:right w:w="100" w:type="dxa"/>
-            </w:tcMar>
-            <w:vAlign w:val="center"/>
+            <w:tcW w:w="2000" w:type="dxa"/>
+            <w:tcMar>
+              <w:top w:w="60" w:type="dxa"/>
+              <w:left w:w="100" w:type="dxa"/>
+              <w:bottom w:w="60" w:type="dxa"/>
+              <w:right w:w="100" w:type="dxa"/>
+            </w:tcMar>
           </w:tcPr>
           <w:p>
             <w:r>
@@ -942,14 +955,13 @@
         </w:tc>
         <w:tc>
           <w:tcPr>
-            <w:tcW w:w="4241" w:type="dxa"/>
-            <w:tcMar>
-              <w:top w:w="60" w:type="dxa"/>
-              <w:left w:w="100" w:type="dxa"/>
-              <w:bottom w:w="60" w:type="dxa"/>
-              <w:right w:w="100" w:type="dxa"/>
-            </w:tcMar>
-            <w:vAlign w:val="center"/>
+            <w:tcW w:w="4500" w:type="dxa"/>
+            <w:tcMar>
+              <w:top w:w="60" w:type="dxa"/>
+              <w:left w:w="100" w:type="dxa"/>
+              <w:bottom w:w="60" w:type="dxa"/>
+              <w:right w:w="100" w:type="dxa"/>
+            </w:tcMar>
           </w:tcPr>
           <w:p>
             <w:r>
@@ -963,14 +975,13 @@
         </w:tc>
         <w:tc>
           <w:tcPr>
-            <w:tcW w:w="1843" w:type="dxa"/>
-            <w:tcMar>
-              <w:top w:w="60" w:type="dxa"/>
-              <w:left w:w="100" w:type="dxa"/>
-              <w:bottom w:w="60" w:type="dxa"/>
-              <w:right w:w="100" w:type="dxa"/>
-            </w:tcMar>
-            <w:vAlign w:val="center"/>
+            <w:tcW w:w="2300" w:type="dxa"/>
+            <w:tcMar>
+              <w:top w:w="60" w:type="dxa"/>
+              <w:left w:w="100" w:type="dxa"/>
+              <w:bottom w:w="60" w:type="dxa"/>
+              <w:right w:w="100" w:type="dxa"/>
+            </w:tcMar>
           </w:tcPr>
           <w:p>
             <w:pPr>
@@ -981,7 +992,7 @@
                 <w:sz w:val="20"/>
                 <w:szCs w:val="20"/>
               </w:rPr>
-              <w:t>R$ 2.900</w:t>
+              <w:t>R$ 3.900</w:t>
             </w:r>
             <w:r>
               <w:rPr>
@@ -1012,14 +1023,13 @@
         </w:trPr>
         <w:tc>
           <w:tcPr>
-            <w:tcW w:w="0" w:type="auto"/>
-            <w:tcMar>
-              <w:top w:w="60" w:type="dxa"/>
-              <w:left w:w="100" w:type="dxa"/>
-              <w:bottom w:w="60" w:type="dxa"/>
-              <w:right w:w="100" w:type="dxa"/>
-            </w:tcMar>
-            <w:vAlign w:val="center"/>
+            <w:tcW w:w="2000" w:type="dxa"/>
+            <w:tcMar>
+              <w:top w:w="60" w:type="dxa"/>
+              <w:left w:w="100" w:type="dxa"/>
+              <w:bottom w:w="60" w:type="dxa"/>
+              <w:right w:w="100" w:type="dxa"/>
+            </w:tcMar>
           </w:tcPr>
           <w:p>
             <w:r>
@@ -1033,35 +1043,33 @@
         </w:tc>
         <w:tc>
           <w:tcPr>
-            <w:tcW w:w="4241" w:type="dxa"/>
-            <w:tcMar>
-              <w:top w:w="60" w:type="dxa"/>
-              <w:left w:w="100" w:type="dxa"/>
-              <w:bottom w:w="60" w:type="dxa"/>
-              <w:right w:w="100" w:type="dxa"/>
-            </w:tcMar>
-            <w:vAlign w:val="center"/>
-          </w:tcPr>
-          <w:p>
-            <w:r>
-              <w:rPr>
-                <w:sz w:val="20"/>
-                <w:szCs w:val="20"/>
-              </w:rPr>
-              <w:t>Uso livre, sujeito a política de uso justo.</w:t>
-            </w:r>
-          </w:p>
-        </w:tc>
-        <w:tc>
-          <w:tcPr>
-            <w:tcW w:w="1843" w:type="dxa"/>
-            <w:tcMar>
-              <w:top w:w="60" w:type="dxa"/>
-              <w:left w:w="100" w:type="dxa"/>
-              <w:bottom w:w="60" w:type="dxa"/>
-              <w:right w:w="100" w:type="dxa"/>
-            </w:tcMar>
-            <w:vAlign w:val="center"/>
+            <w:tcW w:w="4500" w:type="dxa"/>
+            <w:tcMar>
+              <w:top w:w="60" w:type="dxa"/>
+              <w:left w:w="100" w:type="dxa"/>
+              <w:bottom w:w="60" w:type="dxa"/>
+              <w:right w:w="100" w:type="dxa"/>
+            </w:tcMar>
+          </w:tcPr>
+          <w:p>
+            <w:r>
+              <w:rPr>
+                <w:sz w:val="20"/>
+                <w:szCs w:val="20"/>
+              </w:rPr>
+              <w:t>Uso livre, sujeito a política de uso justo (referência: 60 relatórios/mês).</w:t>
+            </w:r>
+          </w:p>
+        </w:tc>
+        <w:tc>
+          <w:tcPr>
+            <w:tcW w:w="2300" w:type="dxa"/>
+            <w:tcMar>
+              <w:top w:w="60" w:type="dxa"/>
+              <w:left w:w="100" w:type="dxa"/>
+              <w:bottom w:w="60" w:type="dxa"/>
+              <w:right w:w="100" w:type="dxa"/>
+            </w:tcMar>
           </w:tcPr>
           <w:p>
             <w:pPr>
@@ -1072,7 +1080,7 @@
                 <w:sz w:val="20"/>
                 <w:szCs w:val="20"/>
               </w:rPr>
-              <w:t>R$ 4.500</w:t>
+              <w:t>R$ 4.990</w:t>
             </w:r>
             <w:r>
               <w:rPr>
@@ -1103,37 +1111,20 @@
         <w:jc w:val="both"/>
       </w:pPr>
       <w:r>
-        <w:t>Coerência dos pacotes (preço médio por relatório: R$ 106,67): 20 relatórios avulsos somam R$ 2.133 — o Básico a R$ 1.400 embute 34% de desconto; o Profissional, 46%; o Ilimitado, 65% sobre a referência de uso justo. Em termos práticos, o Básico compensa a partir de 13 relatórios por mês, o Profissional a partir de 27 e o Ilimitado a partir de 42.</w:t>
-      </w:r>
-    </w:p>
-    <w:p>
-      <w:pPr>
-        <w:spacing w:after="120"/>
-        <w:jc w:val="both"/>
-      </w:pPr>
-      <w:r>
-        <w:t>Política de uso justo (Ilimitado): uso individual pela organização contratante, sem revenda de relatórios a terceiros nem compartilhamento de acesso; volume de referência de até 120 relatórios/mês.</w:t>
-      </w:r>
-    </w:p>
-    <w:p>
-      <w:pPr>
-        <w:spacing w:after="120"/>
-        <w:jc w:val="both"/>
-      </w:pPr>
-      <w:r>
-        <w:t>Controle já implementado no sistema: ao atingir o limite do plano, a geração é bloqueada com aviso ao usuário; o plano Avulso concede 3 relatórios de cortesia uma única vez, na entrada; o painel do administrador mostra o uso e a cobrança sugerida de cada cliente.</w:t>
-      </w:r>
-    </w:p>
-    <w:p>
-      <w:pPr>
-        <w:pStyle w:val="Ttulo1"/>
-        <w:spacing w:before="280" w:after="120"/>
+        <w:t>Coerência (preço médio por relatório: R$ 220): o Básico embute 43% de desconto sobre o equivalente avulso; o Profissional, 65%; o Ilimitado, 62%. Na prática, o Básico compensa a partir de 11 relatórios por mês, o Profissional a partir de 18 e o Ilimitado a partir de 23.</w:t>
+      </w:r>
+    </w:p>
+    <w:p>
+      <w:pPr>
+        <w:pStyle w:val="Ttulo2"/>
+        <w:spacing w:before="200" w:after="90"/>
+        <w:jc w:val="both"/>
       </w:pPr>
       <w:r>
         <w:rPr>
           <w:color w:val="1A5C6E"/>
         </w:rPr>
-        <w:t>5. Custo de operação e margem</w:t>
+        <w:t>Por que o plano mais caro para em R$ 4.990</w:t>
       </w:r>
     </w:p>
     <w:p>
@@ -1142,19 +1133,20 @@
         <w:jc w:val="both"/>
       </w:pPr>
       <w:r>
-        <w:t>O custo variável dominante é a chamada de IA. Nas condições atuais, o custo típico por relatório fica em centavos de real; se os módulos de nível Alto migrarem para um modelo mais forte, a estimativa é de R$ 2 a R$ 6 por relatório (a medir na prática). Custos fixos: hospedagem enxuta, banco de dados no plano gratuito e domínio. A margem bruta por relatório supera 95% em todos os níveis.</w:t>
+        <w:t>A contratação direta por dispensa de licitação (Lei 14.133/2021, art. 75, II) alcança R$ 65.492,11 no exercício de 2026, valor atualizado pelo Decreto nº 12.807/2025. O plano Ilimitado custa R$ 59.880 por ano — cerca de R$ 5,6 mil abaixo do teto. Essa folga é deliberada: protege contra a variação anual do índice e contra a soma de outras contratações de mesmo objeto no exercício. Ultrapassar esse teto obrigaria o órgão a licitar para contratar a ferramenta, o que significaria meses de espera e concorrência aberta — barreira comercial muito maior do que qualquer ganho de preço.</w:t>
       </w:r>
     </w:p>
     <w:p>
       <w:pPr>
         <w:pStyle w:val="Ttulo1"/>
-        <w:spacing w:before="280" w:after="120"/>
+        <w:spacing w:before="260" w:after="110"/>
+        <w:jc w:val="both"/>
       </w:pPr>
       <w:r>
         <w:rPr>
           <w:color w:val="1A5C6E"/>
         </w:rPr>
-        <w:t>6. Parceria comercial</w:t>
+        <w:t>5. Serviços fora do escopo — como cobrar</w:t>
       </w:r>
     </w:p>
     <w:p>
@@ -1163,24 +1155,93 @@
         <w:jc w:val="both"/>
       </w:pPr>
       <w:r>
-        <w:t>Esta tabela corresponde ao Item II da contraproposta de Daysival (cobrança pelo uso das análises). Pontos a formalizar: percentual de divisão da receita entre RM Vértice Digital (produto/tecnologia) e Daysival (canal comercial/jurídico), prazo das comissões de indicação, responsabilidades de suporte ao cliente, titularidade da marca e da carteira de clientes, e regra de saída. A marca RM Lisura pertence à RM Vértice Digital (depósito em nome do sócio, com cessão à empresa em andamento).</w:t>
-      </w:r>
-    </w:p>
-    <w:p>
-      <w:pPr>
-        <w:pStyle w:val="Ttulo1"/>
-        <w:spacing w:before="280" w:after="120"/>
+        <w:t>Todo cliente, cedo ou tarde, pede algo que a assinatura não cobre. Sem regra prévia, esse trabalho sai de graça e corrói a margem. A solução não é embutir tudo na mensalidade, e sim deixar claro desde o contrato o que está incluído e o que é orçado à parte.</w:t>
+      </w:r>
+    </w:p>
+    <w:p>
+      <w:pPr>
+        <w:pStyle w:val="Ttulo2"/>
+        <w:spacing w:before="200" w:after="90"/>
+        <w:jc w:val="both"/>
       </w:pPr>
       <w:r>
         <w:rPr>
           <w:color w:val="1A5C6E"/>
         </w:rPr>
-        <w:t>7. Operação de cobrança — em fases</w:t>
+        <w:t>O que a assinatura já inclui</w:t>
+      </w:r>
+    </w:p>
+    <w:p>
+      <w:pPr>
+        <w:pStyle w:val="PargrafodaLista"/>
+        <w:numPr>
+          <w:ilvl w:val="0"/>
+          <w:numId w:val="2"/>
+        </w:numPr>
+        <w:spacing w:after="80"/>
+        <w:jc w:val="both"/>
+      </w:pPr>
+      <w:r>
+        <w:t>Uso ilimitado dos módulos dentro do limite do plano contratado.</w:t>
+      </w:r>
+    </w:p>
+    <w:p>
+      <w:pPr>
+        <w:pStyle w:val="PargrafodaLista"/>
+        <w:numPr>
+          <w:ilvl w:val="0"/>
+          <w:numId w:val="2"/>
+        </w:numPr>
+        <w:spacing w:after="80"/>
+        <w:jc w:val="both"/>
+      </w:pPr>
+      <w:r>
+        <w:t>Relatórios em PDF gerados pelo próprio sistema, no formato padrão.</w:t>
+      </w:r>
+    </w:p>
+    <w:p>
+      <w:pPr>
+        <w:pStyle w:val="PargrafodaLista"/>
+        <w:numPr>
+          <w:ilvl w:val="0"/>
+          <w:numId w:val="2"/>
+        </w:numPr>
+        <w:spacing w:after="80"/>
+        <w:jc w:val="both"/>
+      </w:pPr>
+      <w:r>
+        <w:t>Suporte a dúvidas de uso da ferramenta, por e-mail, em até 2 dias úteis.</w:t>
+      </w:r>
+    </w:p>
+    <w:p>
+      <w:pPr>
+        <w:pStyle w:val="PargrafodaLista"/>
+        <w:numPr>
+          <w:ilvl w:val="0"/>
+          <w:numId w:val="2"/>
+        </w:numPr>
+        <w:spacing w:after="80"/>
+        <w:jc w:val="both"/>
+      </w:pPr>
+      <w:r>
+        <w:t>Atualizações do sistema e adequação a mudanças da legislação.</w:t>
+      </w:r>
+    </w:p>
+    <w:p>
+      <w:pPr>
+        <w:pStyle w:val="Ttulo2"/>
+        <w:spacing w:before="200" w:after="90"/>
+      </w:pPr>
+      <w:r>
+        <w:rPr>
+          <w:color w:val="1A5C6E"/>
+        </w:rPr>
+        <w:t>O que é orçado à parte</w:t>
       </w:r>
     </w:p>
     <w:tbl>
       <w:tblPr>
-        <w:tblW w:w="8642" w:type="dxa"/>
+        <w:tblW w:w="8800" w:type="dxa"/>
         <w:jc w:val="center"/>
         <w:tblBorders>
           <w:top w:val="single" w:sz="4" w:space="0" w:color="auto"/>
@@ -1197,9 +1258,9 @@
         <w:tblLook w:val="0000" w:firstRow="0" w:lastRow="0" w:firstColumn="0" w:lastColumn="0" w:noHBand="0" w:noVBand="0"/>
       </w:tblPr>
       <w:tblGrid>
-        <w:gridCol w:w="1413"/>
-        <w:gridCol w:w="4601"/>
-        <w:gridCol w:w="2628"/>
+        <w:gridCol w:w="3700"/>
+        <w:gridCol w:w="3300"/>
+        <w:gridCol w:w="1800"/>
       </w:tblGrid>
       <w:tr>
         <w:tblPrEx>
@@ -1213,7 +1274,7 @@
         </w:trPr>
         <w:tc>
           <w:tcPr>
-            <w:tcW w:w="1413" w:type="dxa"/>
+            <w:tcW w:w="3700" w:type="dxa"/>
             <w:shd w:val="clear" w:color="auto" w:fill="F2F2F2"/>
             <w:tcMar>
               <w:top w:w="60" w:type="dxa"/>
@@ -1221,7 +1282,6 @@
               <w:bottom w:w="60" w:type="dxa"/>
               <w:right w:w="100" w:type="dxa"/>
             </w:tcMar>
-            <w:vAlign w:val="center"/>
           </w:tcPr>
           <w:p>
             <w:pPr>
@@ -1234,13 +1294,13 @@
                 <w:sz w:val="20"/>
                 <w:szCs w:val="20"/>
               </w:rPr>
-              <w:t>Fase</w:t>
-            </w:r>
-          </w:p>
-        </w:tc>
-        <w:tc>
-          <w:tcPr>
-            <w:tcW w:w="4601" w:type="dxa"/>
+              <w:t>Serviço</w:t>
+            </w:r>
+          </w:p>
+        </w:tc>
+        <w:tc>
+          <w:tcPr>
+            <w:tcW w:w="3300" w:type="dxa"/>
             <w:shd w:val="clear" w:color="auto" w:fill="F2F2F2"/>
             <w:tcMar>
               <w:top w:w="60" w:type="dxa"/>
@@ -1248,7 +1308,6 @@
               <w:bottom w:w="60" w:type="dxa"/>
               <w:right w:w="100" w:type="dxa"/>
             </w:tcMar>
-            <w:vAlign w:val="center"/>
           </w:tcPr>
           <w:p>
             <w:pPr>
@@ -1261,13 +1320,13 @@
                 <w:sz w:val="20"/>
                 <w:szCs w:val="20"/>
               </w:rPr>
-              <w:t>O que acontece</w:t>
-            </w:r>
-          </w:p>
-        </w:tc>
-        <w:tc>
-          <w:tcPr>
-            <w:tcW w:w="2628" w:type="dxa"/>
+              <w:t>Quando se aplica</w:t>
+            </w:r>
+          </w:p>
+        </w:tc>
+        <w:tc>
+          <w:tcPr>
+            <w:tcW w:w="1800" w:type="dxa"/>
             <w:shd w:val="clear" w:color="auto" w:fill="F2F2F2"/>
             <w:tcMar>
               <w:top w:w="60" w:type="dxa"/>
@@ -1275,7 +1334,6 @@
               <w:bottom w:w="60" w:type="dxa"/>
               <w:right w:w="100" w:type="dxa"/>
             </w:tcMar>
-            <w:vAlign w:val="center"/>
           </w:tcPr>
           <w:p>
             <w:pPr>
@@ -1288,7 +1346,7 @@
                 <w:sz w:val="20"/>
                 <w:szCs w:val="20"/>
               </w:rPr>
-              <w:t>Situação</w:t>
+              <w:t>Valor de referência</w:t>
             </w:r>
           </w:p>
         </w:tc>
@@ -1305,64 +1363,89 @@
         </w:trPr>
         <w:tc>
           <w:tcPr>
-            <w:tcW w:w="1413" w:type="dxa"/>
-            <w:tcMar>
-              <w:top w:w="60" w:type="dxa"/>
-              <w:left w:w="100" w:type="dxa"/>
-              <w:bottom w:w="60" w:type="dxa"/>
-              <w:right w:w="100" w:type="dxa"/>
-            </w:tcMar>
-            <w:vAlign w:val="center"/>
-          </w:tcPr>
-          <w:p>
-            <w:r>
-              <w:rPr>
-                <w:sz w:val="20"/>
-                <w:szCs w:val="20"/>
-              </w:rPr>
-              <w:t>1. Piloto</w:t>
-            </w:r>
-          </w:p>
-        </w:tc>
-        <w:tc>
-          <w:tcPr>
-            <w:tcW w:w="4601" w:type="dxa"/>
-            <w:tcMar>
-              <w:top w:w="60" w:type="dxa"/>
-              <w:left w:w="100" w:type="dxa"/>
-              <w:bottom w:w="60" w:type="dxa"/>
-              <w:right w:w="100" w:type="dxa"/>
-            </w:tcMar>
-            <w:vAlign w:val="center"/>
-          </w:tcPr>
-          <w:p>
-            <w:r>
-              <w:rPr>
-                <w:sz w:val="20"/>
-                <w:szCs w:val="20"/>
-              </w:rPr>
-              <w:t>2 a 5 clientes convidados usam grátis por 30 dias; colhe depoimentos e calibra preços.</w:t>
-            </w:r>
-          </w:p>
-        </w:tc>
-        <w:tc>
-          <w:tcPr>
-            <w:tcW w:w="2628" w:type="dxa"/>
-            <w:tcMar>
-              <w:top w:w="60" w:type="dxa"/>
-              <w:left w:w="100" w:type="dxa"/>
-              <w:bottom w:w="60" w:type="dxa"/>
-              <w:right w:w="100" w:type="dxa"/>
-            </w:tcMar>
-            <w:vAlign w:val="center"/>
-          </w:tcPr>
-          <w:p>
-            <w:r>
-              <w:rPr>
-                <w:sz w:val="20"/>
-                <w:szCs w:val="20"/>
-              </w:rPr>
-              <w:t>Pronto — cadastro com aprovação no ar.</w:t>
+            <w:tcW w:w="3700" w:type="dxa"/>
+            <w:tcMar>
+              <w:top w:w="60" w:type="dxa"/>
+              <w:left w:w="100" w:type="dxa"/>
+              <w:bottom w:w="60" w:type="dxa"/>
+              <w:right w:w="100" w:type="dxa"/>
+            </w:tcMar>
+          </w:tcPr>
+          <w:p>
+            <w:r>
+              <w:rPr>
+                <w:sz w:val="20"/>
+                <w:szCs w:val="20"/>
+              </w:rPr>
+              <w:t>Implantação de Programa de Integridade</w:t>
+            </w:r>
+          </w:p>
+        </w:tc>
+        <w:tc>
+          <w:tcPr>
+            <w:tcW w:w="3300" w:type="dxa"/>
+            <w:tcMar>
+              <w:top w:w="60" w:type="dxa"/>
+              <w:left w:w="100" w:type="dxa"/>
+              <w:bottom w:w="60" w:type="dxa"/>
+              <w:right w:w="100" w:type="dxa"/>
+            </w:tcMar>
+          </w:tcPr>
+          <w:p>
+            <w:r>
+              <w:rPr>
+                <w:sz w:val="20"/>
+                <w:szCs w:val="20"/>
+              </w:rPr>
+              <w:t>Órgão ou empresa que ainda não possui programa e precisa do plano completo, cronograma e minutas de documentos.</w:t>
+            </w:r>
+          </w:p>
+        </w:tc>
+        <w:tc>
+          <w:tcPr>
+            <w:tcW w:w="1800" w:type="dxa"/>
+            <w:tcMar>
+              <w:top w:w="60" w:type="dxa"/>
+              <w:left w:w="100" w:type="dxa"/>
+              <w:bottom w:w="60" w:type="dxa"/>
+              <w:right w:w="100" w:type="dxa"/>
+            </w:tcMar>
+          </w:tcPr>
+          <w:p>
+            <w:r>
+              <w:rPr>
+                <w:sz w:val="20"/>
+                <w:szCs w:val="20"/>
+              </w:rPr>
+              <w:t>R$ 1.500</w:t>
+            </w:r>
+            <w:r>
+              <w:rPr>
+                <w:sz w:val="20"/>
+                <w:szCs w:val="20"/>
+              </w:rPr>
+              <w:t>,00</w:t>
+            </w:r>
+            <w:r>
+              <w:rPr>
+                <w:sz w:val="20"/>
+                <w:szCs w:val="20"/>
+              </w:rPr>
+              <w:t xml:space="preserve"> a R$ 3.500</w:t>
+            </w:r>
+            <w:r>
+              <w:rPr>
+                <w:sz w:val="20"/>
+                <w:szCs w:val="20"/>
+              </w:rPr>
+              <w:t>,00</w:t>
+            </w:r>
+            <w:r>
+              <w:rPr>
+                <w:sz w:val="20"/>
+                <w:szCs w:val="20"/>
+              </w:rPr>
+              <w:t xml:space="preserve"> por plano</w:t>
             </w:r>
           </w:p>
         </w:tc>
@@ -1379,64 +1462,75 @@
         </w:trPr>
         <w:tc>
           <w:tcPr>
-            <w:tcW w:w="1413" w:type="dxa"/>
-            <w:tcMar>
-              <w:top w:w="60" w:type="dxa"/>
-              <w:left w:w="100" w:type="dxa"/>
-              <w:bottom w:w="60" w:type="dxa"/>
-              <w:right w:w="100" w:type="dxa"/>
-            </w:tcMar>
-            <w:vAlign w:val="center"/>
-          </w:tcPr>
-          <w:p>
-            <w:r>
-              <w:rPr>
-                <w:sz w:val="20"/>
-                <w:szCs w:val="20"/>
-              </w:rPr>
-              <w:t>2. Manual</w:t>
-            </w:r>
-          </w:p>
-        </w:tc>
-        <w:tc>
-          <w:tcPr>
-            <w:tcW w:w="4601" w:type="dxa"/>
-            <w:tcMar>
-              <w:top w:w="60" w:type="dxa"/>
-              <w:left w:w="100" w:type="dxa"/>
-              <w:bottom w:w="60" w:type="dxa"/>
-              <w:right w:w="100" w:type="dxa"/>
-            </w:tcMar>
-            <w:vAlign w:val="center"/>
-          </w:tcPr>
-          <w:p>
-            <w:r>
-              <w:rPr>
-                <w:sz w:val="20"/>
-                <w:szCs w:val="20"/>
-              </w:rPr>
-              <w:t>Cobrança por Pix no fim do mês, conferindo o uso no painel admin.</w:t>
-            </w:r>
-          </w:p>
-        </w:tc>
-        <w:tc>
-          <w:tcPr>
-            <w:tcW w:w="2628" w:type="dxa"/>
-            <w:tcMar>
-              <w:top w:w="60" w:type="dxa"/>
-              <w:left w:w="100" w:type="dxa"/>
-              <w:bottom w:w="60" w:type="dxa"/>
-              <w:right w:w="100" w:type="dxa"/>
-            </w:tcMar>
-            <w:vAlign w:val="center"/>
-          </w:tcPr>
-          <w:p>
-            <w:r>
-              <w:rPr>
-                <w:sz w:val="20"/>
-                <w:szCs w:val="20"/>
-              </w:rPr>
-              <w:t>Pronto — contador de uso e cobrança sugerida funcionando.</w:t>
+            <w:tcW w:w="3700" w:type="dxa"/>
+            <w:tcMar>
+              <w:top w:w="60" w:type="dxa"/>
+              <w:left w:w="100" w:type="dxa"/>
+              <w:bottom w:w="60" w:type="dxa"/>
+              <w:right w:w="100" w:type="dxa"/>
+            </w:tcMar>
+          </w:tcPr>
+          <w:p>
+            <w:r>
+              <w:rPr>
+                <w:sz w:val="20"/>
+                <w:szCs w:val="20"/>
+              </w:rPr>
+              <w:t>Relatório customizado</w:t>
+            </w:r>
+          </w:p>
+        </w:tc>
+        <w:tc>
+          <w:tcPr>
+            <w:tcW w:w="3300" w:type="dxa"/>
+            <w:tcMar>
+              <w:top w:w="60" w:type="dxa"/>
+              <w:left w:w="100" w:type="dxa"/>
+              <w:bottom w:w="60" w:type="dxa"/>
+              <w:right w:w="100" w:type="dxa"/>
+            </w:tcMar>
+          </w:tcPr>
+          <w:p>
+            <w:r>
+              <w:rPr>
+                <w:sz w:val="20"/>
+                <w:szCs w:val="20"/>
+              </w:rPr>
+              <w:t>Análise fora dos módulos existentes, formato específico exigido pelo órgão ou consolidação de vários processos.</w:t>
+            </w:r>
+          </w:p>
+        </w:tc>
+        <w:tc>
+          <w:tcPr>
+            <w:tcW w:w="1800" w:type="dxa"/>
+            <w:tcMar>
+              <w:top w:w="60" w:type="dxa"/>
+              <w:left w:w="100" w:type="dxa"/>
+              <w:bottom w:w="60" w:type="dxa"/>
+              <w:right w:w="100" w:type="dxa"/>
+            </w:tcMar>
+          </w:tcPr>
+          <w:p>
+            <w:r>
+              <w:rPr>
+                <w:sz w:val="20"/>
+                <w:szCs w:val="20"/>
+              </w:rPr>
+              <w:t>R$ 400</w:t>
+            </w:r>
+            <w:r>
+              <w:rPr>
+                <w:sz w:val="20"/>
+                <w:szCs w:val="20"/>
+              </w:rPr>
+              <w:t>,00</w:t>
+            </w:r>
+            <w:r>
+              <w:rPr>
+                <w:sz w:val="20"/>
+                <w:szCs w:val="20"/>
+              </w:rPr>
+              <w:t xml:space="preserve"> por hora</w:t>
             </w:r>
           </w:p>
         </w:tc>
@@ -1453,80 +1547,218 @@
         </w:trPr>
         <w:tc>
           <w:tcPr>
-            <w:tcW w:w="1413" w:type="dxa"/>
-            <w:tcMar>
-              <w:top w:w="60" w:type="dxa"/>
-              <w:left w:w="100" w:type="dxa"/>
-              <w:bottom w:w="60" w:type="dxa"/>
-              <w:right w:w="100" w:type="dxa"/>
-            </w:tcMar>
-            <w:vAlign w:val="center"/>
-          </w:tcPr>
-          <w:p>
-            <w:r>
-              <w:rPr>
-                <w:sz w:val="20"/>
-                <w:szCs w:val="20"/>
-              </w:rPr>
-              <w:t>3. Automática</w:t>
-            </w:r>
-          </w:p>
-        </w:tc>
-        <w:tc>
-          <w:tcPr>
-            <w:tcW w:w="4601" w:type="dxa"/>
-            <w:tcMar>
-              <w:top w:w="60" w:type="dxa"/>
-              <w:left w:w="100" w:type="dxa"/>
-              <w:bottom w:w="60" w:type="dxa"/>
-              <w:right w:w="100" w:type="dxa"/>
-            </w:tcMar>
-            <w:vAlign w:val="center"/>
-          </w:tcPr>
-          <w:p>
-            <w:r>
-              <w:rPr>
-                <w:sz w:val="20"/>
-                <w:szCs w:val="20"/>
-              </w:rPr>
-              <w:t xml:space="preserve">Assinatura/pacotes com cartão (Mercado Pago ou </w:t>
-            </w:r>
-            <w:proofErr w:type="spellStart"/>
-            <w:r>
-              <w:rPr>
-                <w:sz w:val="20"/>
-                <w:szCs w:val="20"/>
-              </w:rPr>
-              <w:t>Stripe</w:t>
-            </w:r>
-            <w:proofErr w:type="spellEnd"/>
-            <w:r>
-              <w:rPr>
-                <w:sz w:val="20"/>
-                <w:szCs w:val="20"/>
-              </w:rPr>
-              <w:t>); bloqueio automático por inadimplência.</w:t>
-            </w:r>
-          </w:p>
-        </w:tc>
-        <w:tc>
-          <w:tcPr>
-            <w:tcW w:w="2628" w:type="dxa"/>
-            <w:tcMar>
-              <w:top w:w="60" w:type="dxa"/>
-              <w:left w:w="100" w:type="dxa"/>
-              <w:bottom w:w="60" w:type="dxa"/>
-              <w:right w:w="100" w:type="dxa"/>
-            </w:tcMar>
-            <w:vAlign w:val="center"/>
-          </w:tcPr>
-          <w:p>
-            <w:r>
-              <w:rPr>
-                <w:sz w:val="20"/>
-                <w:szCs w:val="20"/>
-              </w:rPr>
-              <w:t>A implementar quando houver volume.</w:t>
+            <w:tcW w:w="3700" w:type="dxa"/>
+            <w:tcMar>
+              <w:top w:w="60" w:type="dxa"/>
+              <w:left w:w="100" w:type="dxa"/>
+              <w:bottom w:w="60" w:type="dxa"/>
+              <w:right w:w="100" w:type="dxa"/>
+            </w:tcMar>
+          </w:tcPr>
+          <w:p>
+            <w:r>
+              <w:rPr>
+                <w:sz w:val="20"/>
+                <w:szCs w:val="20"/>
+              </w:rPr>
+              <w:lastRenderedPageBreak/>
+              <w:t>Treinamento da equipe</w:t>
+            </w:r>
+          </w:p>
+        </w:tc>
+        <w:tc>
+          <w:tcPr>
+            <w:tcW w:w="3300" w:type="dxa"/>
+            <w:tcMar>
+              <w:top w:w="60" w:type="dxa"/>
+              <w:left w:w="100" w:type="dxa"/>
+              <w:bottom w:w="60" w:type="dxa"/>
+              <w:right w:w="100" w:type="dxa"/>
+            </w:tcMar>
+          </w:tcPr>
+          <w:p>
+            <w:r>
+              <w:rPr>
+                <w:sz w:val="20"/>
+                <w:szCs w:val="20"/>
+              </w:rPr>
+              <w:t>Capacitação presencial ou remota da equipe do órgão no uso da ferramenta e nos conceitos aplicados.</w:t>
+            </w:r>
+          </w:p>
+        </w:tc>
+        <w:tc>
+          <w:tcPr>
+            <w:tcW w:w="1800" w:type="dxa"/>
+            <w:tcMar>
+              <w:top w:w="60" w:type="dxa"/>
+              <w:left w:w="100" w:type="dxa"/>
+              <w:bottom w:w="60" w:type="dxa"/>
+              <w:right w:w="100" w:type="dxa"/>
+            </w:tcMar>
+          </w:tcPr>
+          <w:p>
+            <w:r>
+              <w:rPr>
+                <w:sz w:val="20"/>
+                <w:szCs w:val="20"/>
+              </w:rPr>
+              <w:t>R$ 1.200</w:t>
+            </w:r>
+            <w:r>
+              <w:rPr>
+                <w:sz w:val="20"/>
+                <w:szCs w:val="20"/>
+              </w:rPr>
+              <w:t>,00</w:t>
+            </w:r>
+            <w:r>
+              <w:rPr>
+                <w:sz w:val="20"/>
+                <w:szCs w:val="20"/>
+              </w:rPr>
+              <w:t xml:space="preserve"> por sessão</w:t>
+            </w:r>
+          </w:p>
+        </w:tc>
+      </w:tr>
+      <w:tr>
+        <w:tblPrEx>
+          <w:tblCellMar>
+            <w:top w:w="0" w:type="dxa"/>
+            <w:bottom w:w="0" w:type="dxa"/>
+          </w:tblCellMar>
+        </w:tblPrEx>
+        <w:trPr>
+          <w:jc w:val="center"/>
+        </w:trPr>
+        <w:tc>
+          <w:tcPr>
+            <w:tcW w:w="3700" w:type="dxa"/>
+            <w:tcMar>
+              <w:top w:w="60" w:type="dxa"/>
+              <w:left w:w="100" w:type="dxa"/>
+              <w:bottom w:w="60" w:type="dxa"/>
+              <w:right w:w="100" w:type="dxa"/>
+            </w:tcMar>
+          </w:tcPr>
+          <w:p>
+            <w:r>
+              <w:rPr>
+                <w:sz w:val="20"/>
+                <w:szCs w:val="20"/>
+              </w:rPr>
+              <w:t>Desenvolvimento de módulo sob medida</w:t>
+            </w:r>
+          </w:p>
+        </w:tc>
+        <w:tc>
+          <w:tcPr>
+            <w:tcW w:w="3300" w:type="dxa"/>
+            <w:tcMar>
+              <w:top w:w="60" w:type="dxa"/>
+              <w:left w:w="100" w:type="dxa"/>
+              <w:bottom w:w="60" w:type="dxa"/>
+              <w:right w:w="100" w:type="dxa"/>
+            </w:tcMar>
+          </w:tcPr>
+          <w:p>
+            <w:r>
+              <w:rPr>
+                <w:sz w:val="20"/>
+                <w:szCs w:val="20"/>
+              </w:rPr>
+              <w:t>Demanda específica que exija programação nova e passe a integrar o sistema.</w:t>
+            </w:r>
+          </w:p>
+        </w:tc>
+        <w:tc>
+          <w:tcPr>
+            <w:tcW w:w="1800" w:type="dxa"/>
+            <w:tcMar>
+              <w:top w:w="60" w:type="dxa"/>
+              <w:left w:w="100" w:type="dxa"/>
+              <w:bottom w:w="60" w:type="dxa"/>
+              <w:right w:w="100" w:type="dxa"/>
+            </w:tcMar>
+          </w:tcPr>
+          <w:p>
+            <w:r>
+              <w:rPr>
+                <w:sz w:val="20"/>
+                <w:szCs w:val="20"/>
+              </w:rPr>
+              <w:t>Orçamento por projeto</w:t>
+            </w:r>
+          </w:p>
+        </w:tc>
+      </w:tr>
+      <w:tr>
+        <w:tblPrEx>
+          <w:tblCellMar>
+            <w:top w:w="0" w:type="dxa"/>
+            <w:bottom w:w="0" w:type="dxa"/>
+          </w:tblCellMar>
+        </w:tblPrEx>
+        <w:trPr>
+          <w:jc w:val="center"/>
+        </w:trPr>
+        <w:tc>
+          <w:tcPr>
+            <w:tcW w:w="3700" w:type="dxa"/>
+            <w:tcMar>
+              <w:top w:w="60" w:type="dxa"/>
+              <w:left w:w="100" w:type="dxa"/>
+              <w:bottom w:w="60" w:type="dxa"/>
+              <w:right w:w="100" w:type="dxa"/>
+            </w:tcMar>
+          </w:tcPr>
+          <w:p>
+            <w:r>
+              <w:rPr>
+                <w:sz w:val="20"/>
+                <w:szCs w:val="20"/>
+              </w:rPr>
+              <w:t>Parecer jurídico sobre caso concreto</w:t>
+            </w:r>
+          </w:p>
+        </w:tc>
+        <w:tc>
+          <w:tcPr>
+            <w:tcW w:w="3300" w:type="dxa"/>
+            <w:tcMar>
+              <w:top w:w="60" w:type="dxa"/>
+              <w:left w:w="100" w:type="dxa"/>
+              <w:bottom w:w="60" w:type="dxa"/>
+              <w:right w:w="100" w:type="dxa"/>
+            </w:tcMar>
+          </w:tcPr>
+          <w:p>
+            <w:r>
+              <w:rPr>
+                <w:sz w:val="20"/>
+                <w:szCs w:val="20"/>
+              </w:rPr>
+              <w:t>Análise jurídica de situação específica, com responsabilidade técnica de advogado.</w:t>
+            </w:r>
+          </w:p>
+        </w:tc>
+        <w:tc>
+          <w:tcPr>
+            <w:tcW w:w="1800" w:type="dxa"/>
+            <w:tcMar>
+              <w:top w:w="60" w:type="dxa"/>
+              <w:left w:w="100" w:type="dxa"/>
+              <w:bottom w:w="60" w:type="dxa"/>
+              <w:right w:w="100" w:type="dxa"/>
+            </w:tcMar>
+          </w:tcPr>
+          <w:p>
+            <w:r>
+              <w:rPr>
+                <w:sz w:val="20"/>
+                <w:szCs w:val="20"/>
+              </w:rPr>
+              <w:t>Encaminhado ao parceiro jurídico; contratação direta entre ele e o cliente</w:t>
             </w:r>
           </w:p>
         </w:tc>
@@ -1539,24 +1771,14 @@
     </w:p>
     <w:p>
       <w:pPr>
-        <w:spacing w:after="120"/>
-        <w:jc w:val="both"/>
-      </w:pPr>
-      <w:r>
-        <w:t>Formalização: emissão de nota fiscal pela RM Vértice Digital (CNPJ 68.118.290/0001-06) e contrato simples de licença de uso, com aviso de não-substituição de parecer jurídico.</w:t>
-      </w:r>
-    </w:p>
-    <w:p>
-      <w:pPr>
-        <w:pStyle w:val="Ttulo1"/>
-        <w:spacing w:before="280" w:after="120"/>
+        <w:pStyle w:val="Ttulo2"/>
+        <w:spacing w:before="200" w:after="90"/>
       </w:pPr>
       <w:r>
         <w:rPr>
           <w:color w:val="1A5C6E"/>
         </w:rPr>
-        <w:lastRenderedPageBreak/>
-        <w:t>8. Metas iniciais (6 meses)</w:t>
+        <w:t>Regras de cobrança dos extras</w:t>
       </w:r>
     </w:p>
     <w:p>
@@ -1570,7 +1792,7 @@
         <w:jc w:val="both"/>
       </w:pPr>
       <w:r>
-        <w:t>Mês 1–2: piloto com até 5 organizações; meta de 40 relatórios gerados e 3 depoimentos.</w:t>
+        <w:t>Nada é executado sem orçamento escrito e aceite prévio do cliente, ainda que por e-mail ou mensagem — o aceite é o que transforma o pedido em serviço contratado.</w:t>
       </w:r>
     </w:p>
     <w:p>
@@ -1584,7 +1806,7 @@
         <w:jc w:val="both"/>
       </w:pPr>
       <w:r>
-        <w:t>Mês 3–4: converter 3 pilotos em pagantes (mix avulso/Básico); receita alvo R$ 3.000–4.000/mês.</w:t>
+        <w:t>O orçamento indica escopo, prazo e valor fechado. Trabalho por hora só é usado quando o escopo não pode ser fechado de antemão, e nesse caso com teto de horas acordado.</w:t>
       </w:r>
     </w:p>
     <w:p>
@@ -1598,19 +1820,7 @@
         <w:jc w:val="both"/>
       </w:pPr>
       <w:r>
-        <w:t>Mês 5–6: 6 a 10 clientes ativos; receita alvo R$ 8.000–12.000/mês; decidir investimento na Fase 3.</w:t>
-      </w:r>
-    </w:p>
-    <w:p>
-      <w:pPr>
-        <w:pStyle w:val="Ttulo1"/>
-        <w:spacing w:before="280" w:after="120"/>
-      </w:pPr>
-      <w:r>
-        <w:rPr>
-          <w:color w:val="1A5C6E"/>
-        </w:rPr>
-        <w:t>9. Riscos e mitigação</w:t>
+        <w:t>Serviços recorrentes (por exemplo, acompanhamento mensal de uma implantação) viram aditivo à mensalidade, não cobranças avulsas repetidas.</w:t>
       </w:r>
     </w:p>
     <w:p>
@@ -1624,7 +1834,7 @@
         <w:jc w:val="both"/>
       </w:pPr>
       <w:r>
-        <w:t>Custo de IA subir com modelos fortes → medir custo real por relatório desde o piloto.</w:t>
+        <w:t>Pedidos pequenos e pontuais, de até uma hora, podem ser absorvidos como cortesia — é relacionamento, não precedente. Acima disso, orça-se.</w:t>
       </w:r>
     </w:p>
     <w:p>
@@ -1638,23 +1848,420 @@
         <w:jc w:val="both"/>
       </w:pPr>
       <w:r>
-        <w:t xml:space="preserve">Responsabilidade por erro da análise → </w:t>
-      </w:r>
-      <w:proofErr w:type="spellStart"/>
-      <w:r>
-        <w:t>disclaimers</w:t>
-      </w:r>
-      <w:proofErr w:type="spellEnd"/>
-      <w:r>
-        <w:t xml:space="preserve"> em app e </w:t>
-      </w:r>
-      <w:proofErr w:type="spellStart"/>
-      <w:r>
-        <w:t>PDFs</w:t>
-      </w:r>
-      <w:proofErr w:type="spellEnd"/>
-      <w:r>
-        <w:t>; contrato reforça caráter de apoio.</w:t>
+        <w:t>O parecer jurídico sobre caso concreto é serviço do parceiro advogado, contratado diretamente pelo cliente com ele. A plataforma não intermedeia nem fatura essa relação.</w:t>
+      </w:r>
+    </w:p>
+    <w:p>
+      <w:pPr>
+        <w:pStyle w:val="Ttulo1"/>
+        <w:spacing w:before="260" w:after="110"/>
+        <w:jc w:val="both"/>
+      </w:pPr>
+      <w:r>
+        <w:rPr>
+          <w:color w:val="1A5C6E"/>
+        </w:rPr>
+        <w:t>6. Parceria comercial</w:t>
+      </w:r>
+    </w:p>
+    <w:p>
+      <w:pPr>
+        <w:spacing w:after="120"/>
+        <w:jc w:val="both"/>
+      </w:pPr>
+      <w:r>
+        <w:t>Esta tabela corresponde ao Item II da contraproposta do parceiro jurídico (cobrança pelo uso das análises). Pontos a formalizar em instrumento escrito: percentual e prazo das comissões de indicação, responsabilidades de suporte ao cliente, curadoria jurídica do produto, titularidade da marca e da carteira, regra de saída e participação em eventual cenário de venda futura. A marca RM Lisura pertence à RM Vértice Digital (depósito em nome do sócio, com cessão à empresa em andamento).</w:t>
+      </w:r>
+    </w:p>
+    <w:p>
+      <w:pPr>
+        <w:spacing w:after="120"/>
+        <w:jc w:val="both"/>
+      </w:pPr>
+      <w:r>
+        <w:t>A tabela de honorários do parceiro aplica-se aos clientes dele, e não às entregas desta parceria — o que reforça a distinção entre o serviço jurídico dele e o produto da plataforma.</w:t>
+      </w:r>
+    </w:p>
+    <w:p>
+      <w:pPr>
+        <w:pStyle w:val="Ttulo1"/>
+        <w:spacing w:before="260" w:after="110"/>
+      </w:pPr>
+      <w:r>
+        <w:rPr>
+          <w:color w:val="1A5C6E"/>
+        </w:rPr>
+        <w:t>7. Operação de cobrança — em fases</w:t>
+      </w:r>
+    </w:p>
+    <w:tbl>
+      <w:tblPr>
+        <w:tblW w:w="8800" w:type="dxa"/>
+        <w:jc w:val="center"/>
+        <w:tblBorders>
+          <w:top w:val="single" w:sz="4" w:space="0" w:color="auto"/>
+          <w:left w:val="single" w:sz="4" w:space="0" w:color="auto"/>
+          <w:bottom w:val="single" w:sz="4" w:space="0" w:color="auto"/>
+          <w:right w:val="single" w:sz="4" w:space="0" w:color="auto"/>
+          <w:insideH w:val="single" w:sz="4" w:space="0" w:color="auto"/>
+          <w:insideV w:val="single" w:sz="4" w:space="0" w:color="auto"/>
+        </w:tblBorders>
+        <w:tblCellMar>
+          <w:left w:w="10" w:type="dxa"/>
+          <w:right w:w="10" w:type="dxa"/>
+        </w:tblCellMar>
+        <w:tblLook w:val="0000" w:firstRow="0" w:lastRow="0" w:firstColumn="0" w:lastColumn="0" w:noHBand="0" w:noVBand="0"/>
+      </w:tblPr>
+      <w:tblGrid>
+        <w:gridCol w:w="1143"/>
+        <w:gridCol w:w="4870"/>
+        <w:gridCol w:w="2787"/>
+      </w:tblGrid>
+      <w:tr>
+        <w:tblPrEx>
+          <w:tblCellMar>
+            <w:top w:w="0" w:type="dxa"/>
+            <w:bottom w:w="0" w:type="dxa"/>
+          </w:tblCellMar>
+        </w:tblPrEx>
+        <w:trPr>
+          <w:jc w:val="center"/>
+        </w:trPr>
+        <w:tc>
+          <w:tcPr>
+            <w:tcW w:w="1100" w:type="dxa"/>
+            <w:shd w:val="clear" w:color="auto" w:fill="F2F2F2"/>
+            <w:tcMar>
+              <w:top w:w="60" w:type="dxa"/>
+              <w:left w:w="100" w:type="dxa"/>
+              <w:bottom w:w="60" w:type="dxa"/>
+              <w:right w:w="100" w:type="dxa"/>
+            </w:tcMar>
+          </w:tcPr>
+          <w:p>
+            <w:pPr>
+              <w:jc w:val="center"/>
+            </w:pPr>
+            <w:r>
+              <w:rPr>
+                <w:b/>
+                <w:bCs/>
+                <w:sz w:val="20"/>
+                <w:szCs w:val="20"/>
+              </w:rPr>
+              <w:t>Fase</w:t>
+            </w:r>
+          </w:p>
+        </w:tc>
+        <w:tc>
+          <w:tcPr>
+            <w:tcW w:w="4900" w:type="dxa"/>
+            <w:shd w:val="clear" w:color="auto" w:fill="F2F2F2"/>
+            <w:tcMar>
+              <w:top w:w="60" w:type="dxa"/>
+              <w:left w:w="100" w:type="dxa"/>
+              <w:bottom w:w="60" w:type="dxa"/>
+              <w:right w:w="100" w:type="dxa"/>
+            </w:tcMar>
+          </w:tcPr>
+          <w:p>
+            <w:pPr>
+              <w:jc w:val="center"/>
+            </w:pPr>
+            <w:r>
+              <w:rPr>
+                <w:b/>
+                <w:bCs/>
+                <w:sz w:val="20"/>
+                <w:szCs w:val="20"/>
+              </w:rPr>
+              <w:t>O que acontece</w:t>
+            </w:r>
+          </w:p>
+        </w:tc>
+        <w:tc>
+          <w:tcPr>
+            <w:tcW w:w="2800" w:type="dxa"/>
+            <w:shd w:val="clear" w:color="auto" w:fill="F2F2F2"/>
+            <w:tcMar>
+              <w:top w:w="60" w:type="dxa"/>
+              <w:left w:w="100" w:type="dxa"/>
+              <w:bottom w:w="60" w:type="dxa"/>
+              <w:right w:w="100" w:type="dxa"/>
+            </w:tcMar>
+          </w:tcPr>
+          <w:p>
+            <w:pPr>
+              <w:jc w:val="center"/>
+            </w:pPr>
+            <w:r>
+              <w:rPr>
+                <w:b/>
+                <w:bCs/>
+                <w:sz w:val="20"/>
+                <w:szCs w:val="20"/>
+              </w:rPr>
+              <w:t>Situação</w:t>
+            </w:r>
+          </w:p>
+        </w:tc>
+      </w:tr>
+      <w:tr>
+        <w:tblPrEx>
+          <w:tblCellMar>
+            <w:top w:w="0" w:type="dxa"/>
+            <w:bottom w:w="0" w:type="dxa"/>
+          </w:tblCellMar>
+        </w:tblPrEx>
+        <w:trPr>
+          <w:jc w:val="center"/>
+        </w:trPr>
+        <w:tc>
+          <w:tcPr>
+            <w:tcW w:w="1100" w:type="dxa"/>
+            <w:tcMar>
+              <w:top w:w="60" w:type="dxa"/>
+              <w:left w:w="100" w:type="dxa"/>
+              <w:bottom w:w="60" w:type="dxa"/>
+              <w:right w:w="100" w:type="dxa"/>
+            </w:tcMar>
+          </w:tcPr>
+          <w:p>
+            <w:r>
+              <w:rPr>
+                <w:sz w:val="20"/>
+                <w:szCs w:val="20"/>
+              </w:rPr>
+              <w:t>1. Piloto</w:t>
+            </w:r>
+          </w:p>
+        </w:tc>
+        <w:tc>
+          <w:tcPr>
+            <w:tcW w:w="4900" w:type="dxa"/>
+            <w:tcMar>
+              <w:top w:w="60" w:type="dxa"/>
+              <w:left w:w="100" w:type="dxa"/>
+              <w:bottom w:w="60" w:type="dxa"/>
+              <w:right w:w="100" w:type="dxa"/>
+            </w:tcMar>
+          </w:tcPr>
+          <w:p>
+            <w:r>
+              <w:rPr>
+                <w:sz w:val="20"/>
+                <w:szCs w:val="20"/>
+              </w:rPr>
+              <w:t>2 a 5 clientes convidados usam gratuitamente por 30 dias; colhe depoimentos e calibra preços.</w:t>
+            </w:r>
+          </w:p>
+        </w:tc>
+        <w:tc>
+          <w:tcPr>
+            <w:tcW w:w="2800" w:type="dxa"/>
+            <w:tcMar>
+              <w:top w:w="60" w:type="dxa"/>
+              <w:left w:w="100" w:type="dxa"/>
+              <w:bottom w:w="60" w:type="dxa"/>
+              <w:right w:w="100" w:type="dxa"/>
+            </w:tcMar>
+          </w:tcPr>
+          <w:p>
+            <w:r>
+              <w:rPr>
+                <w:sz w:val="20"/>
+                <w:szCs w:val="20"/>
+              </w:rPr>
+              <w:t>Pronto — cadastro com aprovação no ar.</w:t>
+            </w:r>
+          </w:p>
+        </w:tc>
+      </w:tr>
+      <w:tr>
+        <w:tblPrEx>
+          <w:tblCellMar>
+            <w:top w:w="0" w:type="dxa"/>
+            <w:bottom w:w="0" w:type="dxa"/>
+          </w:tblCellMar>
+        </w:tblPrEx>
+        <w:trPr>
+          <w:jc w:val="center"/>
+        </w:trPr>
+        <w:tc>
+          <w:tcPr>
+            <w:tcW w:w="1100" w:type="dxa"/>
+            <w:tcMar>
+              <w:top w:w="60" w:type="dxa"/>
+              <w:left w:w="100" w:type="dxa"/>
+              <w:bottom w:w="60" w:type="dxa"/>
+              <w:right w:w="100" w:type="dxa"/>
+            </w:tcMar>
+          </w:tcPr>
+          <w:p>
+            <w:r>
+              <w:rPr>
+                <w:sz w:val="20"/>
+                <w:szCs w:val="20"/>
+              </w:rPr>
+              <w:t>2. Manual</w:t>
+            </w:r>
+          </w:p>
+        </w:tc>
+        <w:tc>
+          <w:tcPr>
+            <w:tcW w:w="4900" w:type="dxa"/>
+            <w:tcMar>
+              <w:top w:w="60" w:type="dxa"/>
+              <w:left w:w="100" w:type="dxa"/>
+              <w:bottom w:w="60" w:type="dxa"/>
+              <w:right w:w="100" w:type="dxa"/>
+            </w:tcMar>
+          </w:tcPr>
+          <w:p>
+            <w:r>
+              <w:rPr>
+                <w:sz w:val="20"/>
+                <w:szCs w:val="20"/>
+              </w:rPr>
+              <w:t>Cobrança por Pix no fechamento do mês, conferindo o uso no painel administrativo.</w:t>
+            </w:r>
+          </w:p>
+        </w:tc>
+        <w:tc>
+          <w:tcPr>
+            <w:tcW w:w="2800" w:type="dxa"/>
+            <w:tcMar>
+              <w:top w:w="60" w:type="dxa"/>
+              <w:left w:w="100" w:type="dxa"/>
+              <w:bottom w:w="60" w:type="dxa"/>
+              <w:right w:w="100" w:type="dxa"/>
+            </w:tcMar>
+          </w:tcPr>
+          <w:p>
+            <w:r>
+              <w:rPr>
+                <w:sz w:val="20"/>
+                <w:szCs w:val="20"/>
+              </w:rPr>
+              <w:t>Pronto — contador de uso e cobrança sugerida funcionando.</w:t>
+            </w:r>
+          </w:p>
+        </w:tc>
+      </w:tr>
+      <w:tr>
+        <w:tblPrEx>
+          <w:tblCellMar>
+            <w:top w:w="0" w:type="dxa"/>
+            <w:bottom w:w="0" w:type="dxa"/>
+          </w:tblCellMar>
+        </w:tblPrEx>
+        <w:trPr>
+          <w:jc w:val="center"/>
+        </w:trPr>
+        <w:tc>
+          <w:tcPr>
+            <w:tcW w:w="1100" w:type="dxa"/>
+            <w:tcMar>
+              <w:top w:w="60" w:type="dxa"/>
+              <w:left w:w="100" w:type="dxa"/>
+              <w:bottom w:w="60" w:type="dxa"/>
+              <w:right w:w="100" w:type="dxa"/>
+            </w:tcMar>
+          </w:tcPr>
+          <w:p>
+            <w:r>
+              <w:rPr>
+                <w:sz w:val="20"/>
+                <w:szCs w:val="20"/>
+              </w:rPr>
+              <w:t>3. Automática</w:t>
+            </w:r>
+          </w:p>
+        </w:tc>
+        <w:tc>
+          <w:tcPr>
+            <w:tcW w:w="4900" w:type="dxa"/>
+            <w:tcMar>
+              <w:top w:w="60" w:type="dxa"/>
+              <w:left w:w="100" w:type="dxa"/>
+              <w:bottom w:w="60" w:type="dxa"/>
+              <w:right w:w="100" w:type="dxa"/>
+            </w:tcMar>
+          </w:tcPr>
+          <w:p>
+            <w:r>
+              <w:rPr>
+                <w:sz w:val="20"/>
+                <w:szCs w:val="20"/>
+              </w:rPr>
+              <w:t xml:space="preserve">Assinatura com cartão (Mercado Pago ou </w:t>
+            </w:r>
+            <w:proofErr w:type="spellStart"/>
+            <w:r>
+              <w:rPr>
+                <w:sz w:val="20"/>
+                <w:szCs w:val="20"/>
+              </w:rPr>
+              <w:t>Stripe</w:t>
+            </w:r>
+            <w:proofErr w:type="spellEnd"/>
+            <w:r>
+              <w:rPr>
+                <w:sz w:val="20"/>
+                <w:szCs w:val="20"/>
+              </w:rPr>
+              <w:t>) e bloqueio automático por inadimplência.</w:t>
+            </w:r>
+          </w:p>
+        </w:tc>
+        <w:tc>
+          <w:tcPr>
+            <w:tcW w:w="2800" w:type="dxa"/>
+            <w:tcMar>
+              <w:top w:w="60" w:type="dxa"/>
+              <w:left w:w="100" w:type="dxa"/>
+              <w:bottom w:w="60" w:type="dxa"/>
+              <w:right w:w="100" w:type="dxa"/>
+            </w:tcMar>
+          </w:tcPr>
+          <w:p>
+            <w:r>
+              <w:rPr>
+                <w:sz w:val="20"/>
+                <w:szCs w:val="20"/>
+              </w:rPr>
+              <w:t>A implementar quando houver volume.</w:t>
+            </w:r>
+          </w:p>
+        </w:tc>
+      </w:tr>
+    </w:tbl>
+    <w:p>
+      <w:pPr>
+        <w:spacing w:after="120"/>
+      </w:pPr>
+    </w:p>
+    <w:p>
+      <w:pPr>
+        <w:spacing w:after="120"/>
+        <w:jc w:val="both"/>
+      </w:pPr>
+      <w:r>
+        <w:t>Formalização: nota fiscal emitida pela RM Vértice Digital e contrato de licença de uso com escopo, tabela de extras e aviso de não-substituição de parecer jurídico.</w:t>
+      </w:r>
+    </w:p>
+    <w:p>
+      <w:pPr>
+        <w:pStyle w:val="Ttulo1"/>
+        <w:spacing w:before="260" w:after="110"/>
+        <w:jc w:val="both"/>
+      </w:pPr>
+      <w:r>
+        <w:rPr>
+          <w:color w:val="1A5C6E"/>
+        </w:rPr>
+        <w:lastRenderedPageBreak/>
+        <w:t>8. Metas iniciais (6 meses)</w:t>
       </w:r>
     </w:p>
     <w:p>
@@ -1668,7 +2275,7 @@
         <w:jc w:val="both"/>
       </w:pPr>
       <w:r>
-        <w:t>Inadimplência na fase manual → pacotes pré-pagos; Fase 3 automatiza o bloqueio.</w:t>
+        <w:t>Mês 1–2: piloto com até 5 organizações; meta de 40 relatórios gerados e 3 depoimentos.</w:t>
       </w:r>
     </w:p>
     <w:p>
@@ -1682,7 +2289,7 @@
         <w:jc w:val="both"/>
       </w:pPr>
       <w:r>
-        <w:t>Concorrência de plataformas grandes → foco em nicho (municípios pequenos + canal jurídico) e atuação nas fases que os concorrentes não cobrem.</w:t>
+        <w:t>Mês 3–4: converter 3 pilotos em pagantes; receita alvo R$ 5.000 a R$ 7.500/mês.</w:t>
       </w:r>
     </w:p>
     <w:p>
@@ -1696,7 +2303,112 @@
         <w:jc w:val="both"/>
       </w:pPr>
       <w:r>
-        <w:t>Marca → depósito no INPI já feito; acompanhar publicação na RPI e prazo de oposição.</w:t>
+        <w:t>Mês 5–6: 6 a 10 clientes ativos; receita alvo R$ 15.000 a R$ 25.000/mês; decidir investimento na cobrança automática.</w:t>
+      </w:r>
+    </w:p>
+    <w:p>
+      <w:pPr>
+        <w:pStyle w:val="Ttulo1"/>
+        <w:spacing w:before="260" w:after="110"/>
+        <w:jc w:val="both"/>
+      </w:pPr>
+      <w:r>
+        <w:rPr>
+          <w:color w:val="1A5C6E"/>
+        </w:rPr>
+        <w:t>9. Riscos e mitigação</w:t>
+      </w:r>
+    </w:p>
+    <w:p>
+      <w:pPr>
+        <w:pStyle w:val="PargrafodaLista"/>
+        <w:numPr>
+          <w:ilvl w:val="0"/>
+          <w:numId w:val="2"/>
+        </w:numPr>
+        <w:spacing w:after="80"/>
+        <w:jc w:val="both"/>
+      </w:pPr>
+      <w:r>
+        <w:t>Preço acima da capacidade do município pequeno → o plano Básico e o avulso mantêm porta de entrada acessível; o piloto gratuito reduz a barreira inicial.</w:t>
+      </w:r>
+    </w:p>
+    <w:p>
+      <w:pPr>
+        <w:pStyle w:val="PargrafodaLista"/>
+        <w:numPr>
+          <w:ilvl w:val="0"/>
+          <w:numId w:val="2"/>
+        </w:numPr>
+        <w:spacing w:after="80"/>
+        <w:jc w:val="both"/>
+      </w:pPr>
+      <w:r>
+        <w:t>Contrato ultrapassar o teto de dispensa → planos dimensionados com folga; renovações revistas em janeiro, quando o limite é reajustado.</w:t>
+      </w:r>
+    </w:p>
+    <w:p>
+      <w:pPr>
+        <w:pStyle w:val="PargrafodaLista"/>
+        <w:numPr>
+          <w:ilvl w:val="0"/>
+          <w:numId w:val="2"/>
+        </w:numPr>
+        <w:spacing w:after="80"/>
+        <w:jc w:val="both"/>
+      </w:pPr>
+      <w:r>
+        <w:t>Pedidos fora do escopo corroendo a margem → tabela de extras e regra de aceite prévio por escrito.</w:t>
+      </w:r>
+    </w:p>
+    <w:p>
+      <w:pPr>
+        <w:pStyle w:val="PargrafodaLista"/>
+        <w:numPr>
+          <w:ilvl w:val="0"/>
+          <w:numId w:val="2"/>
+        </w:numPr>
+        <w:spacing w:after="80"/>
+        <w:jc w:val="both"/>
+      </w:pPr>
+      <w:r>
+        <w:t xml:space="preserve">Responsabilidade por erro da análise → avisos em app e </w:t>
+      </w:r>
+      <w:proofErr w:type="spellStart"/>
+      <w:r>
+        <w:t>PDFs</w:t>
+      </w:r>
+      <w:proofErr w:type="spellEnd"/>
+      <w:r>
+        <w:t>, sistema que distingue verificado de não verificado, e contrato reforçando o caráter de apoio.</w:t>
+      </w:r>
+    </w:p>
+    <w:p>
+      <w:pPr>
+        <w:pStyle w:val="PargrafodaLista"/>
+        <w:numPr>
+          <w:ilvl w:val="0"/>
+          <w:numId w:val="2"/>
+        </w:numPr>
+        <w:spacing w:after="80"/>
+        <w:jc w:val="both"/>
+      </w:pPr>
+      <w:r>
+        <w:t>Custo de IA subir com modelos mais fortes → medir custo real por relatório desde o piloto.</w:t>
+      </w:r>
+    </w:p>
+    <w:p>
+      <w:pPr>
+        <w:pStyle w:val="PargrafodaLista"/>
+        <w:numPr>
+          <w:ilvl w:val="0"/>
+          <w:numId w:val="2"/>
+        </w:numPr>
+        <w:spacing w:after="80"/>
+        <w:jc w:val="both"/>
+      </w:pPr>
+      <w:r>
+        <w:t>Marca → depósito no INPI concluído; acompanhar publicação na RPI e prazo de oposição.</w:t>
       </w:r>
     </w:p>
     <w:p>
@@ -1727,96 +2439,10 @@
 <file path=word/numbering.xml><?xml version="1.0" encoding="utf-8"?>
 <w:numbering xmlns:wpc="http://schemas.microsoft.com/office/word/2010/wordprocessingCanvas" xmlns:cx="http://schemas.microsoft.com/office/drawing/2014/chartex" xmlns:cx1="http://schemas.microsoft.com/office/drawing/2015/9/8/chartex" xmlns:cx2="http://schemas.microsoft.com/office/drawing/2015/10/21/chartex" xmlns:cx3="http://schemas.microsoft.com/office/drawing/2016/5/9/chartex" xmlns:cx4="http://schemas.microsoft.com/office/drawing/2016/5/10/chartex" xmlns:cx5="http://schemas.microsoft.com/office/drawing/2016/5/11/chartex" xmlns:cx6="http://schemas.microsoft.com/office/drawing/2016/5/12/chartex" xmlns:cx7="http://schemas.microsoft.com/office/drawing/2016/5/13/chartex" xmlns:cx8="http://schemas.microsoft.com/office/drawing/2016/5/14/chartex" xmlns:mc="http://schemas.openxmlformats.org/markup-compatibility/2006" xmlns:m="http://schemas.openxmlformats.org/officeDocument/2006/math" xmlns:aink="http://schemas.microsoft.com/office/drawing/2016/ink" xmlns:am3d="http://schemas.microsoft.com/office/drawing/2017/model3d" xmlns:oel="http://schemas.microsoft.com/office/2019/extlst" xmlns:r="http://schemas.openxmlformats.org/officeDocument/2006/relationships" xmlns:wp14="http://schemas.microsoft.com/office/word/2010/wordprocessingDrawing" xmlns:wp="http://schemas.openxmlformats.org/drawingml/2006/wordprocessingDrawing" xmlns:wpg="http://schemas.microsoft.com/office/word/2010/wordprocessingGroup" xmlns:wpi="http://schemas.microsoft.com/office/word/2010/wordprocessingInk" xmlns:wps="http://schemas.microsoft.com/office/word/2010/wordprocessingShape" xmlns:o="urn:schemas-microsoft-com:office:office" xmlns:v="urn:schemas-microsoft-com:vml" xmlns:w10="urn:schemas-microsoft-com:office:word" xmlns:w="http://schemas.openxmlformats.org/wordprocessingml/2006/main" xmlns:w14="http://schemas.microsoft.com/office/word/2010/wordml" xmlns:w15="http://schemas.microsoft.com/office/word/2012/wordml" xmlns:w16cei="http://schemas.microsoft.com/office/word/2026/wordml/cei" xmlns:w16cex="http://schemas.microsoft.com/office/word/2018/wordml/cex" xmlns:w16cid="http://schemas.microsoft.com/office/word/2016/wordml/cid" xmlns:w16="http://schemas.microsoft.com/office/word/2018/wordml" xmlns:w16sdtdh="http://schemas.microsoft.com/office/word/2020/wordml/sdtdatahash" xmlns:w16sdtfl="http://schemas.microsoft.com/office/word/2024/wordml/sdtformatlock" xmlns:w16se="http://schemas.microsoft.com/office/word/2015/wordml/symex" xmlns:w16du="http://schemas.microsoft.com/office/word/2023/wordml/word16du" xmlns:wne="http://schemas.microsoft.com/office/word/2006/wordml" mc:Ignorable="w14 w15 w16se w16cid w16 w16cex w16sdtdh w16sdtfl w16du wp14">
   <w:abstractNum w:abstractNumId="0" w15:restartNumberingAfterBreak="0">
-    <w:nsid w:val="55531DE2"/>
+    <w:nsid w:val="332F5342"/>
     <w:multiLevelType w:val="hybridMultilevel"/>
-    <w:tmpl w:val="540E0204"/>
-    <w:lvl w:ilvl="0" w:tplc="9AC05630">
-      <w:start w:val="1"/>
-      <w:numFmt w:val="bullet"/>
-      <w:lvlText w:val="●"/>
-      <w:lvlJc w:val="left"/>
-      <w:pPr>
-        <w:ind w:left="720" w:hanging="360"/>
-      </w:pPr>
-    </w:lvl>
-    <w:lvl w:ilvl="1" w:tplc="DD28DCAE">
-      <w:start w:val="1"/>
-      <w:numFmt w:val="bullet"/>
-      <w:lvlText w:val="○"/>
-      <w:lvlJc w:val="left"/>
-      <w:pPr>
-        <w:ind w:left="1440" w:hanging="360"/>
-      </w:pPr>
-    </w:lvl>
-    <w:lvl w:ilvl="2" w:tplc="8AC645B8">
-      <w:start w:val="1"/>
-      <w:numFmt w:val="bullet"/>
-      <w:lvlText w:val="■"/>
-      <w:lvlJc w:val="left"/>
-      <w:pPr>
-        <w:ind w:left="2160" w:hanging="360"/>
-      </w:pPr>
-    </w:lvl>
-    <w:lvl w:ilvl="3" w:tplc="37BED6F0">
-      <w:start w:val="1"/>
-      <w:numFmt w:val="bullet"/>
-      <w:lvlText w:val="●"/>
-      <w:lvlJc w:val="left"/>
-      <w:pPr>
-        <w:ind w:left="2880" w:hanging="360"/>
-      </w:pPr>
-    </w:lvl>
-    <w:lvl w:ilvl="4" w:tplc="45CE872C">
-      <w:start w:val="1"/>
-      <w:numFmt w:val="bullet"/>
-      <w:lvlText w:val="○"/>
-      <w:lvlJc w:val="left"/>
-      <w:pPr>
-        <w:ind w:left="3600" w:hanging="360"/>
-      </w:pPr>
-    </w:lvl>
-    <w:lvl w:ilvl="5" w:tplc="0C64B28E">
-      <w:start w:val="1"/>
-      <w:numFmt w:val="bullet"/>
-      <w:lvlText w:val="■"/>
-      <w:lvlJc w:val="left"/>
-      <w:pPr>
-        <w:ind w:left="4320" w:hanging="360"/>
-      </w:pPr>
-    </w:lvl>
-    <w:lvl w:ilvl="6" w:tplc="9FA8926E">
-      <w:start w:val="1"/>
-      <w:numFmt w:val="bullet"/>
-      <w:lvlText w:val="●"/>
-      <w:lvlJc w:val="left"/>
-      <w:pPr>
-        <w:ind w:left="5040" w:hanging="360"/>
-      </w:pPr>
-    </w:lvl>
-    <w:lvl w:ilvl="7" w:tplc="02747B12">
-      <w:start w:val="1"/>
-      <w:numFmt w:val="bullet"/>
-      <w:lvlText w:val="●"/>
-      <w:lvlJc w:val="left"/>
-      <w:pPr>
-        <w:ind w:left="5760" w:hanging="360"/>
-      </w:pPr>
-    </w:lvl>
-    <w:lvl w:ilvl="8" w:tplc="FF52812A">
-      <w:start w:val="1"/>
-      <w:numFmt w:val="bullet"/>
-      <w:lvlText w:val="●"/>
-      <w:lvlJc w:val="left"/>
-      <w:pPr>
-        <w:ind w:left="6480" w:hanging="360"/>
-      </w:pPr>
-    </w:lvl>
-  </w:abstractNum>
-  <w:abstractNum w:abstractNumId="1" w15:restartNumberingAfterBreak="0">
-    <w:nsid w:val="5DB5352A"/>
-    <w:multiLevelType w:val="hybridMultilevel"/>
-    <w:tmpl w:val="8258E4E8"/>
-    <w:lvl w:ilvl="0" w:tplc="416674D2">
+    <w:tmpl w:val="A0B00F9E"/>
+    <w:lvl w:ilvl="0" w:tplc="87A2B788">
       <w:start w:val="1"/>
       <w:numFmt w:val="bullet"/>
       <w:lvlText w:val="•"/>
@@ -1825,55 +2451,141 @@
         <w:ind w:left="360" w:hanging="200"/>
       </w:pPr>
     </w:lvl>
-    <w:lvl w:ilvl="1" w:tplc="F9EEE782">
+    <w:lvl w:ilvl="1" w:tplc="7302AA24">
       <w:numFmt w:val="decimal"/>
       <w:lvlText w:val=""/>
       <w:lvlJc w:val="left"/>
     </w:lvl>
-    <w:lvl w:ilvl="2" w:tplc="F7CCF546">
+    <w:lvl w:ilvl="2" w:tplc="B964CE78">
       <w:numFmt w:val="decimal"/>
       <w:lvlText w:val=""/>
       <w:lvlJc w:val="left"/>
     </w:lvl>
-    <w:lvl w:ilvl="3" w:tplc="41FE3B8A">
+    <w:lvl w:ilvl="3" w:tplc="70F6FA84">
       <w:numFmt w:val="decimal"/>
       <w:lvlText w:val=""/>
       <w:lvlJc w:val="left"/>
     </w:lvl>
-    <w:lvl w:ilvl="4" w:tplc="8F46D8C8">
+    <w:lvl w:ilvl="4" w:tplc="21A64FF6">
       <w:numFmt w:val="decimal"/>
       <w:lvlText w:val=""/>
       <w:lvlJc w:val="left"/>
     </w:lvl>
-    <w:lvl w:ilvl="5" w:tplc="F9DE474E">
+    <w:lvl w:ilvl="5" w:tplc="E96ED49C">
       <w:numFmt w:val="decimal"/>
       <w:lvlText w:val=""/>
       <w:lvlJc w:val="left"/>
     </w:lvl>
-    <w:lvl w:ilvl="6" w:tplc="08224484">
+    <w:lvl w:ilvl="6" w:tplc="1454546E">
       <w:numFmt w:val="decimal"/>
       <w:lvlText w:val=""/>
       <w:lvlJc w:val="left"/>
     </w:lvl>
-    <w:lvl w:ilvl="7" w:tplc="0C4E7588">
+    <w:lvl w:ilvl="7" w:tplc="62444254">
       <w:numFmt w:val="decimal"/>
       <w:lvlText w:val=""/>
       <w:lvlJc w:val="left"/>
     </w:lvl>
-    <w:lvl w:ilvl="8" w:tplc="533CA080">
+    <w:lvl w:ilvl="8" w:tplc="E9B2FCD4">
       <w:numFmt w:val="decimal"/>
       <w:lvlText w:val=""/>
       <w:lvlJc w:val="left"/>
     </w:lvl>
   </w:abstractNum>
-  <w:num w:numId="1" w16cid:durableId="1582326463">
-    <w:abstractNumId w:val="0"/>
+  <w:abstractNum w:abstractNumId="1" w15:restartNumberingAfterBreak="0">
+    <w:nsid w:val="5232165B"/>
+    <w:multiLevelType w:val="hybridMultilevel"/>
+    <w:tmpl w:val="F4EA4442"/>
+    <w:lvl w:ilvl="0" w:tplc="EA08B9C0">
+      <w:start w:val="1"/>
+      <w:numFmt w:val="bullet"/>
+      <w:lvlText w:val="●"/>
+      <w:lvlJc w:val="left"/>
+      <w:pPr>
+        <w:ind w:left="720" w:hanging="360"/>
+      </w:pPr>
+    </w:lvl>
+    <w:lvl w:ilvl="1" w:tplc="68DE9C92">
+      <w:start w:val="1"/>
+      <w:numFmt w:val="bullet"/>
+      <w:lvlText w:val="○"/>
+      <w:lvlJc w:val="left"/>
+      <w:pPr>
+        <w:ind w:left="1440" w:hanging="360"/>
+      </w:pPr>
+    </w:lvl>
+    <w:lvl w:ilvl="2" w:tplc="32D43504">
+      <w:start w:val="1"/>
+      <w:numFmt w:val="bullet"/>
+      <w:lvlText w:val="■"/>
+      <w:lvlJc w:val="left"/>
+      <w:pPr>
+        <w:ind w:left="2160" w:hanging="360"/>
+      </w:pPr>
+    </w:lvl>
+    <w:lvl w:ilvl="3" w:tplc="313EA22A">
+      <w:start w:val="1"/>
+      <w:numFmt w:val="bullet"/>
+      <w:lvlText w:val="●"/>
+      <w:lvlJc w:val="left"/>
+      <w:pPr>
+        <w:ind w:left="2880" w:hanging="360"/>
+      </w:pPr>
+    </w:lvl>
+    <w:lvl w:ilvl="4" w:tplc="A0242A0C">
+      <w:start w:val="1"/>
+      <w:numFmt w:val="bullet"/>
+      <w:lvlText w:val="○"/>
+      <w:lvlJc w:val="left"/>
+      <w:pPr>
+        <w:ind w:left="3600" w:hanging="360"/>
+      </w:pPr>
+    </w:lvl>
+    <w:lvl w:ilvl="5" w:tplc="8DCC7366">
+      <w:start w:val="1"/>
+      <w:numFmt w:val="bullet"/>
+      <w:lvlText w:val="■"/>
+      <w:lvlJc w:val="left"/>
+      <w:pPr>
+        <w:ind w:left="4320" w:hanging="360"/>
+      </w:pPr>
+    </w:lvl>
+    <w:lvl w:ilvl="6" w:tplc="AFB8A604">
+      <w:start w:val="1"/>
+      <w:numFmt w:val="bullet"/>
+      <w:lvlText w:val="●"/>
+      <w:lvlJc w:val="left"/>
+      <w:pPr>
+        <w:ind w:left="5040" w:hanging="360"/>
+      </w:pPr>
+    </w:lvl>
+    <w:lvl w:ilvl="7" w:tplc="811ED22C">
+      <w:start w:val="1"/>
+      <w:numFmt w:val="bullet"/>
+      <w:lvlText w:val="●"/>
+      <w:lvlJc w:val="left"/>
+      <w:pPr>
+        <w:ind w:left="5760" w:hanging="360"/>
+      </w:pPr>
+    </w:lvl>
+    <w:lvl w:ilvl="8" w:tplc="5822A428">
+      <w:start w:val="1"/>
+      <w:numFmt w:val="bullet"/>
+      <w:lvlText w:val="●"/>
+      <w:lvlJc w:val="left"/>
+      <w:pPr>
+        <w:ind w:left="6480" w:hanging="360"/>
+      </w:pPr>
+    </w:lvl>
+  </w:abstractNum>
+  <w:num w:numId="1" w16cid:durableId="451898004">
+    <w:abstractNumId w:val="1"/>
     <w:lvlOverride w:ilvl="0">
       <w:startOverride w:val="1"/>
     </w:lvlOverride>
   </w:num>
-  <w:num w:numId="2" w16cid:durableId="576328710">
-    <w:abstractNumId w:val="1"/>
+  <w:num w:numId="2" w16cid:durableId="263849917">
+    <w:abstractNumId w:val="0"/>
     <w:lvlOverride w:ilvl="0">
       <w:startOverride w:val="1"/>
     </w:lvlOverride>

</xml_diff>

<commit_message>
Logomarca RM Lisura no app, no favicon e nos 12 relatorios
</commit_message>
<xml_diff>
--- a/Plano_Comercializacao_RM_Lisura.docx
+++ b/Plano_Comercializacao_RM_Lisura.docx
@@ -269,12 +269,6 @@
         <w:gridCol w:w="2300"/>
       </w:tblGrid>
       <w:tr>
-        <w:tblPrEx>
-          <w:tblCellMar>
-            <w:top w:w="0" w:type="dxa"/>
-            <w:bottom w:w="0" w:type="dxa"/>
-          </w:tblCellMar>
-        </w:tblPrEx>
         <w:trPr>
           <w:jc w:val="center"/>
         </w:trPr>
@@ -288,6 +282,7 @@
               <w:bottom w:w="60" w:type="dxa"/>
               <w:right w:w="100" w:type="dxa"/>
             </w:tcMar>
+            <w:vAlign w:val="center"/>
           </w:tcPr>
           <w:p>
             <w:pPr>
@@ -314,6 +309,7 @@
               <w:bottom w:w="60" w:type="dxa"/>
               <w:right w:w="100" w:type="dxa"/>
             </w:tcMar>
+            <w:vAlign w:val="center"/>
           </w:tcPr>
           <w:p>
             <w:pPr>
@@ -340,6 +336,7 @@
               <w:bottom w:w="60" w:type="dxa"/>
               <w:right w:w="100" w:type="dxa"/>
             </w:tcMar>
+            <w:vAlign w:val="center"/>
           </w:tcPr>
           <w:p>
             <w:pPr>
@@ -358,12 +355,6 @@
         </w:tc>
       </w:tr>
       <w:tr>
-        <w:tblPrEx>
-          <w:tblCellMar>
-            <w:top w:w="0" w:type="dxa"/>
-            <w:bottom w:w="0" w:type="dxa"/>
-          </w:tblCellMar>
-        </w:tblPrEx>
         <w:trPr>
           <w:jc w:val="center"/>
         </w:trPr>
@@ -376,6 +367,7 @@
               <w:bottom w:w="60" w:type="dxa"/>
               <w:right w:w="100" w:type="dxa"/>
             </w:tcMar>
+            <w:vAlign w:val="center"/>
           </w:tcPr>
           <w:p>
             <w:r>
@@ -396,6 +388,7 @@
               <w:bottom w:w="60" w:type="dxa"/>
               <w:right w:w="100" w:type="dxa"/>
             </w:tcMar>
+            <w:vAlign w:val="center"/>
           </w:tcPr>
           <w:p>
             <w:r>
@@ -448,6 +441,7 @@
               <w:bottom w:w="60" w:type="dxa"/>
               <w:right w:w="100" w:type="dxa"/>
             </w:tcMar>
+            <w:vAlign w:val="center"/>
           </w:tcPr>
           <w:p>
             <w:pPr>
@@ -471,12 +465,6 @@
         </w:tc>
       </w:tr>
       <w:tr>
-        <w:tblPrEx>
-          <w:tblCellMar>
-            <w:top w:w="0" w:type="dxa"/>
-            <w:bottom w:w="0" w:type="dxa"/>
-          </w:tblCellMar>
-        </w:tblPrEx>
         <w:trPr>
           <w:jc w:val="center"/>
         </w:trPr>
@@ -489,6 +477,7 @@
               <w:bottom w:w="60" w:type="dxa"/>
               <w:right w:w="100" w:type="dxa"/>
             </w:tcMar>
+            <w:vAlign w:val="center"/>
           </w:tcPr>
           <w:p>
             <w:r>
@@ -509,6 +498,7 @@
               <w:bottom w:w="60" w:type="dxa"/>
               <w:right w:w="100" w:type="dxa"/>
             </w:tcMar>
+            <w:vAlign w:val="center"/>
           </w:tcPr>
           <w:p>
             <w:r>
@@ -529,6 +519,7 @@
               <w:bottom w:w="60" w:type="dxa"/>
               <w:right w:w="100" w:type="dxa"/>
             </w:tcMar>
+            <w:vAlign w:val="center"/>
           </w:tcPr>
           <w:p>
             <w:pPr>
@@ -552,12 +543,6 @@
         </w:tc>
       </w:tr>
       <w:tr>
-        <w:tblPrEx>
-          <w:tblCellMar>
-            <w:top w:w="0" w:type="dxa"/>
-            <w:bottom w:w="0" w:type="dxa"/>
-          </w:tblCellMar>
-        </w:tblPrEx>
         <w:trPr>
           <w:jc w:val="center"/>
         </w:trPr>
@@ -570,6 +555,7 @@
               <w:bottom w:w="60" w:type="dxa"/>
               <w:right w:w="100" w:type="dxa"/>
             </w:tcMar>
+            <w:vAlign w:val="center"/>
           </w:tcPr>
           <w:p>
             <w:r>
@@ -591,6 +577,7 @@
               <w:bottom w:w="60" w:type="dxa"/>
               <w:right w:w="100" w:type="dxa"/>
             </w:tcMar>
+            <w:vAlign w:val="center"/>
           </w:tcPr>
           <w:p>
             <w:r>
@@ -611,6 +598,7 @@
               <w:bottom w:w="60" w:type="dxa"/>
               <w:right w:w="100" w:type="dxa"/>
             </w:tcMar>
+            <w:vAlign w:val="center"/>
           </w:tcPr>
           <w:p>
             <w:pPr>
@@ -675,12 +663,6 @@
         <w:gridCol w:w="2300"/>
       </w:tblGrid>
       <w:tr>
-        <w:tblPrEx>
-          <w:tblCellMar>
-            <w:top w:w="0" w:type="dxa"/>
-            <w:bottom w:w="0" w:type="dxa"/>
-          </w:tblCellMar>
-        </w:tblPrEx>
         <w:trPr>
           <w:jc w:val="center"/>
         </w:trPr>
@@ -694,8 +676,12 @@
               <w:bottom w:w="60" w:type="dxa"/>
               <w:right w:w="100" w:type="dxa"/>
             </w:tcMar>
-          </w:tcPr>
-          <w:p>
+            <w:vAlign w:val="center"/>
+          </w:tcPr>
+          <w:p>
+            <w:pPr>
+              <w:jc w:val="center"/>
+            </w:pPr>
             <w:r>
               <w:rPr>
                 <w:b/>
@@ -717,8 +703,12 @@
               <w:bottom w:w="60" w:type="dxa"/>
               <w:right w:w="100" w:type="dxa"/>
             </w:tcMar>
-          </w:tcPr>
-          <w:p>
+            <w:vAlign w:val="center"/>
+          </w:tcPr>
+          <w:p>
+            <w:pPr>
+              <w:jc w:val="center"/>
+            </w:pPr>
             <w:r>
               <w:rPr>
                 <w:b/>
@@ -740,8 +730,12 @@
               <w:bottom w:w="60" w:type="dxa"/>
               <w:right w:w="100" w:type="dxa"/>
             </w:tcMar>
-          </w:tcPr>
-          <w:p>
+            <w:vAlign w:val="center"/>
+          </w:tcPr>
+          <w:p>
+            <w:pPr>
+              <w:jc w:val="center"/>
+            </w:pPr>
             <w:r>
               <w:rPr>
                 <w:b/>
@@ -755,12 +749,6 @@
         </w:tc>
       </w:tr>
       <w:tr>
-        <w:tblPrEx>
-          <w:tblCellMar>
-            <w:top w:w="0" w:type="dxa"/>
-            <w:bottom w:w="0" w:type="dxa"/>
-          </w:tblCellMar>
-        </w:tblPrEx>
         <w:trPr>
           <w:jc w:val="center"/>
         </w:trPr>
@@ -773,6 +761,7 @@
               <w:bottom w:w="60" w:type="dxa"/>
               <w:right w:w="100" w:type="dxa"/>
             </w:tcMar>
+            <w:vAlign w:val="center"/>
           </w:tcPr>
           <w:p>
             <w:r>
@@ -793,6 +782,7 @@
               <w:bottom w:w="60" w:type="dxa"/>
               <w:right w:w="100" w:type="dxa"/>
             </w:tcMar>
+            <w:vAlign w:val="center"/>
           </w:tcPr>
           <w:p>
             <w:r>
@@ -813,6 +803,7 @@
               <w:bottom w:w="60" w:type="dxa"/>
               <w:right w:w="100" w:type="dxa"/>
             </w:tcMar>
+            <w:vAlign w:val="center"/>
           </w:tcPr>
           <w:p>
             <w:pPr>
@@ -823,25 +814,12 @@
                 <w:sz w:val="20"/>
                 <w:szCs w:val="20"/>
               </w:rPr>
-              <w:t>s</w:t>
-            </w:r>
-            <w:r>
-              <w:rPr>
-                <w:sz w:val="20"/>
-                <w:szCs w:val="20"/>
-              </w:rPr>
-              <w:t>em mensalidade</w:t>
+              <w:t>sem mensalidade</w:t>
             </w:r>
           </w:p>
         </w:tc>
       </w:tr>
       <w:tr>
-        <w:tblPrEx>
-          <w:tblCellMar>
-            <w:top w:w="0" w:type="dxa"/>
-            <w:bottom w:w="0" w:type="dxa"/>
-          </w:tblCellMar>
-        </w:tblPrEx>
         <w:trPr>
           <w:jc w:val="center"/>
         </w:trPr>
@@ -854,6 +832,7 @@
               <w:bottom w:w="60" w:type="dxa"/>
               <w:right w:w="100" w:type="dxa"/>
             </w:tcMar>
+            <w:vAlign w:val="center"/>
           </w:tcPr>
           <w:p>
             <w:r>
@@ -874,6 +853,7 @@
               <w:bottom w:w="60" w:type="dxa"/>
               <w:right w:w="100" w:type="dxa"/>
             </w:tcMar>
+            <w:vAlign w:val="center"/>
           </w:tcPr>
           <w:p>
             <w:r>
@@ -894,6 +874,7 @@
               <w:bottom w:w="60" w:type="dxa"/>
               <w:right w:w="100" w:type="dxa"/>
             </w:tcMar>
+            <w:vAlign w:val="center"/>
           </w:tcPr>
           <w:p>
             <w:pPr>
@@ -924,12 +905,6 @@
         </w:tc>
       </w:tr>
       <w:tr>
-        <w:tblPrEx>
-          <w:tblCellMar>
-            <w:top w:w="0" w:type="dxa"/>
-            <w:bottom w:w="0" w:type="dxa"/>
-          </w:tblCellMar>
-        </w:tblPrEx>
         <w:trPr>
           <w:jc w:val="center"/>
         </w:trPr>
@@ -942,6 +917,7 @@
               <w:bottom w:w="60" w:type="dxa"/>
               <w:right w:w="100" w:type="dxa"/>
             </w:tcMar>
+            <w:vAlign w:val="center"/>
           </w:tcPr>
           <w:p>
             <w:r>
@@ -962,6 +938,7 @@
               <w:bottom w:w="60" w:type="dxa"/>
               <w:right w:w="100" w:type="dxa"/>
             </w:tcMar>
+            <w:vAlign w:val="center"/>
           </w:tcPr>
           <w:p>
             <w:r>
@@ -982,6 +959,7 @@
               <w:bottom w:w="60" w:type="dxa"/>
               <w:right w:w="100" w:type="dxa"/>
             </w:tcMar>
+            <w:vAlign w:val="center"/>
           </w:tcPr>
           <w:p>
             <w:pPr>
@@ -1012,12 +990,6 @@
         </w:tc>
       </w:tr>
       <w:tr>
-        <w:tblPrEx>
-          <w:tblCellMar>
-            <w:top w:w="0" w:type="dxa"/>
-            <w:bottom w:w="0" w:type="dxa"/>
-          </w:tblCellMar>
-        </w:tblPrEx>
         <w:trPr>
           <w:jc w:val="center"/>
         </w:trPr>
@@ -1030,6 +1002,7 @@
               <w:bottom w:w="60" w:type="dxa"/>
               <w:right w:w="100" w:type="dxa"/>
             </w:tcMar>
+            <w:vAlign w:val="center"/>
           </w:tcPr>
           <w:p>
             <w:r>
@@ -1050,6 +1023,7 @@
               <w:bottom w:w="60" w:type="dxa"/>
               <w:right w:w="100" w:type="dxa"/>
             </w:tcMar>
+            <w:vAlign w:val="center"/>
           </w:tcPr>
           <w:p>
             <w:r>
@@ -1070,6 +1044,7 @@
               <w:bottom w:w="60" w:type="dxa"/>
               <w:right w:w="100" w:type="dxa"/>
             </w:tcMar>
+            <w:vAlign w:val="center"/>
           </w:tcPr>
           <w:p>
             <w:pPr>
@@ -1231,12 +1206,201 @@
       <w:pPr>
         <w:pStyle w:val="Ttulo2"/>
         <w:spacing w:before="200" w:after="90"/>
+        <w:jc w:val="both"/>
       </w:pPr>
       <w:r>
         <w:rPr>
           <w:color w:val="1A5C6E"/>
         </w:rPr>
         <w:t>O que é orçado à parte</w:t>
+      </w:r>
+    </w:p>
+    <w:p>
+      <w:pPr>
+        <w:spacing w:after="120"/>
+        <w:jc w:val="both"/>
+      </w:pPr>
+      <w:r>
+        <w:t>Cada serviço abaixo tem escopo definido. O que estiver fora dele é objeto de novo orçamento — a delimitação protege as duas partes: o cliente sabe exatamente o que recebe, e o fornecedor não absorve trabalho não previsto.</w:t>
+      </w:r>
+    </w:p>
+    <w:p>
+      <w:pPr>
+        <w:pStyle w:val="Ttulo2"/>
+        <w:spacing w:before="200" w:after="90"/>
+        <w:jc w:val="both"/>
+      </w:pPr>
+      <w:r>
+        <w:rPr>
+          <w:color w:val="1A5C6E"/>
+        </w:rPr>
+        <w:t>Implantação de Programa de Integridade — R$ 1.500 a R$ 3.500</w:t>
+      </w:r>
+    </w:p>
+    <w:p>
+      <w:pPr>
+        <w:spacing w:after="120"/>
+        <w:jc w:val="both"/>
+      </w:pPr>
+      <w:r>
+        <w:t>Para órgão ou empresa que ainda não possui programa estruturado. Entrega: Plano de Integridade no formato da CGU, cronograma de implantação por fases e pacote de minutas (ato de instituição, código de ética, política de conflito de interesses, regulamento do canal de denúncias, designação da unidade responsável e matriz de riscos inicial).</w:t>
+      </w:r>
+    </w:p>
+    <w:p>
+      <w:pPr>
+        <w:pStyle w:val="PargrafodaLista"/>
+        <w:numPr>
+          <w:ilvl w:val="0"/>
+          <w:numId w:val="2"/>
+        </w:numPr>
+        <w:spacing w:after="80"/>
+        <w:jc w:val="both"/>
+      </w:pPr>
+      <w:r>
+        <w:t>R$ 1.500 — organização de pequeno porte, estrutura simples, minutas padrão adaptadas ao caso.</w:t>
+      </w:r>
+    </w:p>
+    <w:p>
+      <w:pPr>
+        <w:pStyle w:val="PargrafodaLista"/>
+        <w:numPr>
+          <w:ilvl w:val="0"/>
+          <w:numId w:val="2"/>
+        </w:numPr>
+        <w:spacing w:after="80"/>
+        <w:jc w:val="both"/>
+      </w:pPr>
+      <w:r>
+        <w:lastRenderedPageBreak/>
+        <w:t>R$ 2.500 — porte médio, com mapeamento de riscos específicos e adequação às normas internas existentes.</w:t>
+      </w:r>
+    </w:p>
+    <w:p>
+      <w:pPr>
+        <w:pStyle w:val="PargrafodaLista"/>
+        <w:numPr>
+          <w:ilvl w:val="0"/>
+          <w:numId w:val="2"/>
+        </w:numPr>
+        <w:spacing w:after="80"/>
+        <w:jc w:val="both"/>
+      </w:pPr>
+      <w:r>
+        <w:t>R$ 3.500 — estrutura complexa (múltiplas secretarias ou unidades), risco elevado ou formato próprio exigido pelo órgão.</w:t>
+      </w:r>
+    </w:p>
+    <w:p>
+      <w:pPr>
+        <w:pStyle w:val="PargrafodaLista"/>
+        <w:numPr>
+          <w:ilvl w:val="0"/>
+          <w:numId w:val="2"/>
+        </w:numPr>
+        <w:spacing w:after="80"/>
+        <w:jc w:val="both"/>
+      </w:pPr>
+      <w:r>
+        <w:t>Inclui uma rodada de ajustes após a entrega; rodadas seguintes seguem o valor de relatório customizado.</w:t>
+      </w:r>
+    </w:p>
+    <w:p>
+      <w:pPr>
+        <w:pStyle w:val="PargrafodaLista"/>
+        <w:numPr>
+          <w:ilvl w:val="0"/>
+          <w:numId w:val="2"/>
+        </w:numPr>
+        <w:spacing w:after="80"/>
+        <w:jc w:val="both"/>
+      </w:pPr>
+      <w:r>
+        <w:t>Não inclui: execução do plano, acompanhamento mensal da implantação nem capacitação — contratados à parte.</w:t>
+      </w:r>
+    </w:p>
+    <w:p>
+      <w:pPr>
+        <w:pStyle w:val="Ttulo2"/>
+        <w:spacing w:before="200" w:after="90"/>
+        <w:jc w:val="both"/>
+      </w:pPr>
+      <w:r>
+        <w:rPr>
+          <w:color w:val="1A5C6E"/>
+        </w:rPr>
+        <w:t>Relatório customizado — R$ 400 por hora</w:t>
+      </w:r>
+    </w:p>
+    <w:p>
+      <w:pPr>
+        <w:spacing w:after="120"/>
+        <w:jc w:val="both"/>
+      </w:pPr>
+      <w:r>
+        <w:t>Para análise fora dos módulos existentes, formato específico exigido pelo órgão ou consolidação de vários processos num único documento.</w:t>
+      </w:r>
+    </w:p>
+    <w:p>
+      <w:pPr>
+        <w:pStyle w:val="PargrafodaLista"/>
+        <w:numPr>
+          <w:ilvl w:val="0"/>
+          <w:numId w:val="2"/>
+        </w:numPr>
+        <w:spacing w:after="80"/>
+        <w:jc w:val="both"/>
+      </w:pPr>
+      <w:r>
+        <w:t>Toda contratação por hora tem TETO DE HORAS acordado antes do início. Atingido o teto, o trabalho para e é reavaliado com o cliente — nunca se ultrapassa o orçado sem novo aceite.</w:t>
+      </w:r>
+    </w:p>
+    <w:p>
+      <w:pPr>
+        <w:pStyle w:val="PargrafodaLista"/>
+        <w:numPr>
+          <w:ilvl w:val="0"/>
+          <w:numId w:val="2"/>
+        </w:numPr>
+        <w:spacing w:after="80"/>
+        <w:jc w:val="both"/>
+      </w:pPr>
+      <w:r>
+        <w:t>Mínimo de 2 horas por demanda.</w:t>
+      </w:r>
+    </w:p>
+    <w:p>
+      <w:pPr>
+        <w:pStyle w:val="PargrafodaLista"/>
+        <w:numPr>
+          <w:ilvl w:val="0"/>
+          <w:numId w:val="2"/>
+        </w:numPr>
+        <w:spacing w:after="80"/>
+        <w:jc w:val="both"/>
+      </w:pPr>
+      <w:r>
+        <w:t>O tempo trabalhado é registrado e informado ao cliente junto com a entrega.</w:t>
+      </w:r>
+    </w:p>
+    <w:p>
+      <w:pPr>
+        <w:pStyle w:val="Ttulo2"/>
+        <w:spacing w:before="200" w:after="90"/>
+        <w:jc w:val="both"/>
+      </w:pPr>
+      <w:r>
+        <w:rPr>
+          <w:color w:val="1A5C6E"/>
+        </w:rPr>
+        <w:t>Treinamento da equipe — R$ 1.200 por sessão</w:t>
+      </w:r>
+    </w:p>
+    <w:p>
+      <w:pPr>
+        <w:spacing w:after="120"/>
+        <w:jc w:val="both"/>
+      </w:pPr>
+      <w:r>
+        <w:t>Uma SESSÃO corresponde a um encontro de capacitação com escopo fechado:</w:t>
       </w:r>
     </w:p>
     <w:tbl>
@@ -1258,23 +1422,16 @@
         <w:tblLook w:val="0000" w:firstRow="0" w:lastRow="0" w:firstColumn="0" w:lastColumn="0" w:noHBand="0" w:noVBand="0"/>
       </w:tblPr>
       <w:tblGrid>
-        <w:gridCol w:w="3700"/>
-        <w:gridCol w:w="3300"/>
-        <w:gridCol w:w="1800"/>
+        <w:gridCol w:w="2600"/>
+        <w:gridCol w:w="6200"/>
       </w:tblGrid>
       <w:tr>
-        <w:tblPrEx>
-          <w:tblCellMar>
-            <w:top w:w="0" w:type="dxa"/>
-            <w:bottom w:w="0" w:type="dxa"/>
-          </w:tblCellMar>
-        </w:tblPrEx>
         <w:trPr>
           <w:jc w:val="center"/>
         </w:trPr>
         <w:tc>
           <w:tcPr>
-            <w:tcW w:w="3700" w:type="dxa"/>
+            <w:tcW w:w="2600" w:type="dxa"/>
             <w:shd w:val="clear" w:color="auto" w:fill="F2F2F2"/>
             <w:tcMar>
               <w:top w:w="60" w:type="dxa"/>
@@ -1282,6 +1439,7 @@
               <w:bottom w:w="60" w:type="dxa"/>
               <w:right w:w="100" w:type="dxa"/>
             </w:tcMar>
+            <w:vAlign w:val="center"/>
           </w:tcPr>
           <w:p>
             <w:pPr>
@@ -1294,13 +1452,13 @@
                 <w:sz w:val="20"/>
                 <w:szCs w:val="20"/>
               </w:rPr>
-              <w:t>Serviço</w:t>
-            </w:r>
-          </w:p>
-        </w:tc>
-        <w:tc>
-          <w:tcPr>
-            <w:tcW w:w="3300" w:type="dxa"/>
+              <w:t>Item</w:t>
+            </w:r>
+          </w:p>
+        </w:tc>
+        <w:tc>
+          <w:tcPr>
+            <w:tcW w:w="6200" w:type="dxa"/>
             <w:shd w:val="clear" w:color="auto" w:fill="F2F2F2"/>
             <w:tcMar>
               <w:top w:w="60" w:type="dxa"/>
@@ -1308,6 +1466,7 @@
               <w:bottom w:w="60" w:type="dxa"/>
               <w:right w:w="100" w:type="dxa"/>
             </w:tcMar>
+            <w:vAlign w:val="center"/>
           </w:tcPr>
           <w:p>
             <w:pPr>
@@ -1320,445 +1479,336 @@
                 <w:sz w:val="20"/>
                 <w:szCs w:val="20"/>
               </w:rPr>
-              <w:t>Quando se aplica</w:t>
-            </w:r>
-          </w:p>
-        </w:tc>
-        <w:tc>
-          <w:tcPr>
-            <w:tcW w:w="1800" w:type="dxa"/>
-            <w:shd w:val="clear" w:color="auto" w:fill="F2F2F2"/>
-            <w:tcMar>
-              <w:top w:w="60" w:type="dxa"/>
-              <w:left w:w="100" w:type="dxa"/>
-              <w:bottom w:w="60" w:type="dxa"/>
-              <w:right w:w="100" w:type="dxa"/>
-            </w:tcMar>
-          </w:tcPr>
-          <w:p>
-            <w:pPr>
-              <w:jc w:val="center"/>
-            </w:pPr>
-            <w:r>
-              <w:rPr>
-                <w:b/>
-                <w:bCs/>
-                <w:sz w:val="20"/>
-                <w:szCs w:val="20"/>
-              </w:rPr>
-              <w:t>Valor de referência</w:t>
+              <w:t>Definição</w:t>
             </w:r>
           </w:p>
         </w:tc>
       </w:tr>
       <w:tr>
-        <w:tblPrEx>
-          <w:tblCellMar>
-            <w:top w:w="0" w:type="dxa"/>
-            <w:bottom w:w="0" w:type="dxa"/>
-          </w:tblCellMar>
-        </w:tblPrEx>
         <w:trPr>
           <w:jc w:val="center"/>
         </w:trPr>
         <w:tc>
           <w:tcPr>
-            <w:tcW w:w="3700" w:type="dxa"/>
-            <w:tcMar>
-              <w:top w:w="60" w:type="dxa"/>
-              <w:left w:w="100" w:type="dxa"/>
-              <w:bottom w:w="60" w:type="dxa"/>
-              <w:right w:w="100" w:type="dxa"/>
-            </w:tcMar>
-          </w:tcPr>
-          <w:p>
-            <w:r>
-              <w:rPr>
-                <w:sz w:val="20"/>
-                <w:szCs w:val="20"/>
-              </w:rPr>
-              <w:t>Implantação de Programa de Integridade</w:t>
-            </w:r>
-          </w:p>
-        </w:tc>
-        <w:tc>
-          <w:tcPr>
-            <w:tcW w:w="3300" w:type="dxa"/>
-            <w:tcMar>
-              <w:top w:w="60" w:type="dxa"/>
-              <w:left w:w="100" w:type="dxa"/>
-              <w:bottom w:w="60" w:type="dxa"/>
-              <w:right w:w="100" w:type="dxa"/>
-            </w:tcMar>
-          </w:tcPr>
-          <w:p>
-            <w:r>
-              <w:rPr>
-                <w:sz w:val="20"/>
-                <w:szCs w:val="20"/>
-              </w:rPr>
-              <w:t>Órgão ou empresa que ainda não possui programa e precisa do plano completo, cronograma e minutas de documentos.</w:t>
-            </w:r>
-          </w:p>
-        </w:tc>
-        <w:tc>
-          <w:tcPr>
-            <w:tcW w:w="1800" w:type="dxa"/>
-            <w:tcMar>
-              <w:top w:w="60" w:type="dxa"/>
-              <w:left w:w="100" w:type="dxa"/>
-              <w:bottom w:w="60" w:type="dxa"/>
-              <w:right w:w="100" w:type="dxa"/>
-            </w:tcMar>
-          </w:tcPr>
-          <w:p>
-            <w:r>
-              <w:rPr>
-                <w:sz w:val="20"/>
-                <w:szCs w:val="20"/>
-              </w:rPr>
-              <w:t>R$ 1.500</w:t>
-            </w:r>
-            <w:r>
-              <w:rPr>
-                <w:sz w:val="20"/>
-                <w:szCs w:val="20"/>
-              </w:rPr>
-              <w:t>,00</w:t>
-            </w:r>
-            <w:r>
-              <w:rPr>
-                <w:sz w:val="20"/>
-                <w:szCs w:val="20"/>
-              </w:rPr>
-              <w:t xml:space="preserve"> a R$ 3.500</w:t>
-            </w:r>
-            <w:r>
-              <w:rPr>
-                <w:sz w:val="20"/>
-                <w:szCs w:val="20"/>
-              </w:rPr>
-              <w:t>,00</w:t>
-            </w:r>
-            <w:r>
-              <w:rPr>
-                <w:sz w:val="20"/>
-                <w:szCs w:val="20"/>
-              </w:rPr>
-              <w:t xml:space="preserve"> por plano</w:t>
+            <w:tcW w:w="2600" w:type="dxa"/>
+            <w:tcMar>
+              <w:top w:w="60" w:type="dxa"/>
+              <w:left w:w="100" w:type="dxa"/>
+              <w:bottom w:w="60" w:type="dxa"/>
+              <w:right w:w="100" w:type="dxa"/>
+            </w:tcMar>
+            <w:vAlign w:val="center"/>
+          </w:tcPr>
+          <w:p>
+            <w:r>
+              <w:rPr>
+                <w:sz w:val="20"/>
+                <w:szCs w:val="20"/>
+              </w:rPr>
+              <w:t>Duração</w:t>
+            </w:r>
+          </w:p>
+        </w:tc>
+        <w:tc>
+          <w:tcPr>
+            <w:tcW w:w="6200" w:type="dxa"/>
+            <w:tcMar>
+              <w:top w:w="60" w:type="dxa"/>
+              <w:left w:w="100" w:type="dxa"/>
+              <w:bottom w:w="60" w:type="dxa"/>
+              <w:right w:w="100" w:type="dxa"/>
+            </w:tcMar>
+            <w:vAlign w:val="center"/>
+          </w:tcPr>
+          <w:p>
+            <w:r>
+              <w:rPr>
+                <w:sz w:val="20"/>
+                <w:szCs w:val="20"/>
+              </w:rPr>
+              <w:t>3 horas de conteúdo, com intervalo</w:t>
             </w:r>
           </w:p>
         </w:tc>
       </w:tr>
       <w:tr>
-        <w:tblPrEx>
-          <w:tblCellMar>
-            <w:top w:w="0" w:type="dxa"/>
-            <w:bottom w:w="0" w:type="dxa"/>
-          </w:tblCellMar>
-        </w:tblPrEx>
         <w:trPr>
           <w:jc w:val="center"/>
         </w:trPr>
         <w:tc>
           <w:tcPr>
-            <w:tcW w:w="3700" w:type="dxa"/>
-            <w:tcMar>
-              <w:top w:w="60" w:type="dxa"/>
-              <w:left w:w="100" w:type="dxa"/>
-              <w:bottom w:w="60" w:type="dxa"/>
-              <w:right w:w="100" w:type="dxa"/>
-            </w:tcMar>
-          </w:tcPr>
-          <w:p>
-            <w:r>
-              <w:rPr>
-                <w:sz w:val="20"/>
-                <w:szCs w:val="20"/>
-              </w:rPr>
-              <w:t>Relatório customizado</w:t>
-            </w:r>
-          </w:p>
-        </w:tc>
-        <w:tc>
-          <w:tcPr>
-            <w:tcW w:w="3300" w:type="dxa"/>
-            <w:tcMar>
-              <w:top w:w="60" w:type="dxa"/>
-              <w:left w:w="100" w:type="dxa"/>
-              <w:bottom w:w="60" w:type="dxa"/>
-              <w:right w:w="100" w:type="dxa"/>
-            </w:tcMar>
-          </w:tcPr>
-          <w:p>
-            <w:r>
-              <w:rPr>
-                <w:sz w:val="20"/>
-                <w:szCs w:val="20"/>
-              </w:rPr>
-              <w:t>Análise fora dos módulos existentes, formato específico exigido pelo órgão ou consolidação de vários processos.</w:t>
-            </w:r>
-          </w:p>
-        </w:tc>
-        <w:tc>
-          <w:tcPr>
-            <w:tcW w:w="1800" w:type="dxa"/>
-            <w:tcMar>
-              <w:top w:w="60" w:type="dxa"/>
-              <w:left w:w="100" w:type="dxa"/>
-              <w:bottom w:w="60" w:type="dxa"/>
-              <w:right w:w="100" w:type="dxa"/>
-            </w:tcMar>
-          </w:tcPr>
-          <w:p>
-            <w:r>
-              <w:rPr>
-                <w:sz w:val="20"/>
-                <w:szCs w:val="20"/>
-              </w:rPr>
-              <w:t>R$ 400</w:t>
-            </w:r>
-            <w:r>
-              <w:rPr>
-                <w:sz w:val="20"/>
-                <w:szCs w:val="20"/>
-              </w:rPr>
-              <w:t>,00</w:t>
-            </w:r>
-            <w:r>
-              <w:rPr>
-                <w:sz w:val="20"/>
-                <w:szCs w:val="20"/>
-              </w:rPr>
-              <w:t xml:space="preserve"> por hora</w:t>
+            <w:tcW w:w="2600" w:type="dxa"/>
+            <w:tcMar>
+              <w:top w:w="60" w:type="dxa"/>
+              <w:left w:w="100" w:type="dxa"/>
+              <w:bottom w:w="60" w:type="dxa"/>
+              <w:right w:w="100" w:type="dxa"/>
+            </w:tcMar>
+            <w:vAlign w:val="center"/>
+          </w:tcPr>
+          <w:p>
+            <w:r>
+              <w:rPr>
+                <w:sz w:val="20"/>
+                <w:szCs w:val="20"/>
+              </w:rPr>
+              <w:t>Participantes</w:t>
+            </w:r>
+          </w:p>
+        </w:tc>
+        <w:tc>
+          <w:tcPr>
+            <w:tcW w:w="6200" w:type="dxa"/>
+            <w:tcMar>
+              <w:top w:w="60" w:type="dxa"/>
+              <w:left w:w="100" w:type="dxa"/>
+              <w:bottom w:w="60" w:type="dxa"/>
+              <w:right w:w="100" w:type="dxa"/>
+            </w:tcMar>
+            <w:vAlign w:val="center"/>
+          </w:tcPr>
+          <w:p>
+            <w:r>
+              <w:rPr>
+                <w:sz w:val="20"/>
+                <w:szCs w:val="20"/>
+              </w:rPr>
+              <w:t>até 15 pessoas por turma</w:t>
             </w:r>
           </w:p>
         </w:tc>
       </w:tr>
       <w:tr>
-        <w:tblPrEx>
-          <w:tblCellMar>
-            <w:top w:w="0" w:type="dxa"/>
-            <w:bottom w:w="0" w:type="dxa"/>
-          </w:tblCellMar>
-        </w:tblPrEx>
         <w:trPr>
           <w:jc w:val="center"/>
         </w:trPr>
         <w:tc>
           <w:tcPr>
-            <w:tcW w:w="3700" w:type="dxa"/>
-            <w:tcMar>
-              <w:top w:w="60" w:type="dxa"/>
-              <w:left w:w="100" w:type="dxa"/>
-              <w:bottom w:w="60" w:type="dxa"/>
-              <w:right w:w="100" w:type="dxa"/>
-            </w:tcMar>
-          </w:tcPr>
-          <w:p>
-            <w:r>
-              <w:rPr>
-                <w:sz w:val="20"/>
-                <w:szCs w:val="20"/>
-              </w:rPr>
-              <w:lastRenderedPageBreak/>
-              <w:t>Treinamento da equipe</w:t>
-            </w:r>
-          </w:p>
-        </w:tc>
-        <w:tc>
-          <w:tcPr>
-            <w:tcW w:w="3300" w:type="dxa"/>
-            <w:tcMar>
-              <w:top w:w="60" w:type="dxa"/>
-              <w:left w:w="100" w:type="dxa"/>
-              <w:bottom w:w="60" w:type="dxa"/>
-              <w:right w:w="100" w:type="dxa"/>
-            </w:tcMar>
-          </w:tcPr>
-          <w:p>
-            <w:r>
-              <w:rPr>
-                <w:sz w:val="20"/>
-                <w:szCs w:val="20"/>
-              </w:rPr>
-              <w:t>Capacitação presencial ou remota da equipe do órgão no uso da ferramenta e nos conceitos aplicados.</w:t>
-            </w:r>
-          </w:p>
-        </w:tc>
-        <w:tc>
-          <w:tcPr>
-            <w:tcW w:w="1800" w:type="dxa"/>
-            <w:tcMar>
-              <w:top w:w="60" w:type="dxa"/>
-              <w:left w:w="100" w:type="dxa"/>
-              <w:bottom w:w="60" w:type="dxa"/>
-              <w:right w:w="100" w:type="dxa"/>
-            </w:tcMar>
-          </w:tcPr>
-          <w:p>
-            <w:r>
-              <w:rPr>
-                <w:sz w:val="20"/>
-                <w:szCs w:val="20"/>
-              </w:rPr>
-              <w:t>R$ 1.200</w:t>
-            </w:r>
-            <w:r>
-              <w:rPr>
-                <w:sz w:val="20"/>
-                <w:szCs w:val="20"/>
-              </w:rPr>
-              <w:t>,00</w:t>
-            </w:r>
-            <w:r>
-              <w:rPr>
-                <w:sz w:val="20"/>
-                <w:szCs w:val="20"/>
-              </w:rPr>
-              <w:t xml:space="preserve"> por sessão</w:t>
+            <w:tcW w:w="2600" w:type="dxa"/>
+            <w:tcMar>
+              <w:top w:w="60" w:type="dxa"/>
+              <w:left w:w="100" w:type="dxa"/>
+              <w:bottom w:w="60" w:type="dxa"/>
+              <w:right w:w="100" w:type="dxa"/>
+            </w:tcMar>
+            <w:vAlign w:val="center"/>
+          </w:tcPr>
+          <w:p>
+            <w:r>
+              <w:rPr>
+                <w:sz w:val="20"/>
+                <w:szCs w:val="20"/>
+              </w:rPr>
+              <w:t>Formato</w:t>
+            </w:r>
+          </w:p>
+        </w:tc>
+        <w:tc>
+          <w:tcPr>
+            <w:tcW w:w="6200" w:type="dxa"/>
+            <w:tcMar>
+              <w:top w:w="60" w:type="dxa"/>
+              <w:left w:w="100" w:type="dxa"/>
+              <w:bottom w:w="60" w:type="dxa"/>
+              <w:right w:w="100" w:type="dxa"/>
+            </w:tcMar>
+            <w:vAlign w:val="center"/>
+          </w:tcPr>
+          <w:p>
+            <w:r>
+              <w:rPr>
+                <w:sz w:val="20"/>
+                <w:szCs w:val="20"/>
+              </w:rPr>
+              <w:t>remoto (padrão), por videoconferência</w:t>
             </w:r>
           </w:p>
         </w:tc>
       </w:tr>
       <w:tr>
-        <w:tblPrEx>
-          <w:tblCellMar>
-            <w:top w:w="0" w:type="dxa"/>
-            <w:bottom w:w="0" w:type="dxa"/>
-          </w:tblCellMar>
-        </w:tblPrEx>
         <w:trPr>
           <w:jc w:val="center"/>
         </w:trPr>
         <w:tc>
           <w:tcPr>
-            <w:tcW w:w="3700" w:type="dxa"/>
-            <w:tcMar>
-              <w:top w:w="60" w:type="dxa"/>
-              <w:left w:w="100" w:type="dxa"/>
-              <w:bottom w:w="60" w:type="dxa"/>
-              <w:right w:w="100" w:type="dxa"/>
-            </w:tcMar>
-          </w:tcPr>
-          <w:p>
-            <w:r>
-              <w:rPr>
-                <w:sz w:val="20"/>
-                <w:szCs w:val="20"/>
-              </w:rPr>
-              <w:t>Desenvolvimento de módulo sob medida</w:t>
-            </w:r>
-          </w:p>
-        </w:tc>
-        <w:tc>
-          <w:tcPr>
-            <w:tcW w:w="3300" w:type="dxa"/>
-            <w:tcMar>
-              <w:top w:w="60" w:type="dxa"/>
-              <w:left w:w="100" w:type="dxa"/>
-              <w:bottom w:w="60" w:type="dxa"/>
-              <w:right w:w="100" w:type="dxa"/>
-            </w:tcMar>
-          </w:tcPr>
-          <w:p>
-            <w:r>
-              <w:rPr>
-                <w:sz w:val="20"/>
-                <w:szCs w:val="20"/>
-              </w:rPr>
-              <w:t>Demanda específica que exija programação nova e passe a integrar o sistema.</w:t>
-            </w:r>
-          </w:p>
-        </w:tc>
-        <w:tc>
-          <w:tcPr>
-            <w:tcW w:w="1800" w:type="dxa"/>
-            <w:tcMar>
-              <w:top w:w="60" w:type="dxa"/>
-              <w:left w:w="100" w:type="dxa"/>
-              <w:bottom w:w="60" w:type="dxa"/>
-              <w:right w:w="100" w:type="dxa"/>
-            </w:tcMar>
-          </w:tcPr>
-          <w:p>
-            <w:r>
-              <w:rPr>
-                <w:sz w:val="20"/>
-                <w:szCs w:val="20"/>
-              </w:rPr>
-              <w:t>Orçamento por projeto</w:t>
+            <w:tcW w:w="2600" w:type="dxa"/>
+            <w:tcMar>
+              <w:top w:w="60" w:type="dxa"/>
+              <w:left w:w="100" w:type="dxa"/>
+              <w:bottom w:w="60" w:type="dxa"/>
+              <w:right w:w="100" w:type="dxa"/>
+            </w:tcMar>
+            <w:vAlign w:val="center"/>
+          </w:tcPr>
+          <w:p>
+            <w:r>
+              <w:rPr>
+                <w:sz w:val="20"/>
+                <w:szCs w:val="20"/>
+              </w:rPr>
+              <w:t>Conteúdo</w:t>
+            </w:r>
+          </w:p>
+        </w:tc>
+        <w:tc>
+          <w:tcPr>
+            <w:tcW w:w="6200" w:type="dxa"/>
+            <w:tcMar>
+              <w:top w:w="60" w:type="dxa"/>
+              <w:left w:w="100" w:type="dxa"/>
+              <w:bottom w:w="60" w:type="dxa"/>
+              <w:right w:w="100" w:type="dxa"/>
+            </w:tcMar>
+            <w:vAlign w:val="center"/>
+          </w:tcPr>
+          <w:p>
+            <w:r>
+              <w:rPr>
+                <w:sz w:val="20"/>
+                <w:szCs w:val="20"/>
+              </w:rPr>
+              <w:t>uso da ferramenta, interpretação dos relatórios e conceitos legais aplicados</w:t>
             </w:r>
           </w:p>
         </w:tc>
       </w:tr>
       <w:tr>
-        <w:tblPrEx>
-          <w:tblCellMar>
-            <w:top w:w="0" w:type="dxa"/>
-            <w:bottom w:w="0" w:type="dxa"/>
-          </w:tblCellMar>
-        </w:tblPrEx>
         <w:trPr>
           <w:jc w:val="center"/>
         </w:trPr>
         <w:tc>
           <w:tcPr>
-            <w:tcW w:w="3700" w:type="dxa"/>
-            <w:tcMar>
-              <w:top w:w="60" w:type="dxa"/>
-              <w:left w:w="100" w:type="dxa"/>
-              <w:bottom w:w="60" w:type="dxa"/>
-              <w:right w:w="100" w:type="dxa"/>
-            </w:tcMar>
-          </w:tcPr>
-          <w:p>
-            <w:r>
-              <w:rPr>
-                <w:sz w:val="20"/>
-                <w:szCs w:val="20"/>
-              </w:rPr>
-              <w:t>Parecer jurídico sobre caso concreto</w:t>
-            </w:r>
-          </w:p>
-        </w:tc>
-        <w:tc>
-          <w:tcPr>
-            <w:tcW w:w="3300" w:type="dxa"/>
-            <w:tcMar>
-              <w:top w:w="60" w:type="dxa"/>
-              <w:left w:w="100" w:type="dxa"/>
-              <w:bottom w:w="60" w:type="dxa"/>
-              <w:right w:w="100" w:type="dxa"/>
-            </w:tcMar>
-          </w:tcPr>
-          <w:p>
-            <w:r>
-              <w:rPr>
-                <w:sz w:val="20"/>
-                <w:szCs w:val="20"/>
-              </w:rPr>
-              <w:t>Análise jurídica de situação específica, com responsabilidade técnica de advogado.</w:t>
-            </w:r>
-          </w:p>
-        </w:tc>
-        <w:tc>
-          <w:tcPr>
-            <w:tcW w:w="1800" w:type="dxa"/>
-            <w:tcMar>
-              <w:top w:w="60" w:type="dxa"/>
-              <w:left w:w="100" w:type="dxa"/>
-              <w:bottom w:w="60" w:type="dxa"/>
-              <w:right w:w="100" w:type="dxa"/>
-            </w:tcMar>
-          </w:tcPr>
-          <w:p>
-            <w:r>
-              <w:rPr>
-                <w:sz w:val="20"/>
-                <w:szCs w:val="20"/>
-              </w:rPr>
-              <w:t>Encaminhado ao parceiro jurídico; contratação direta entre ele e o cliente</w:t>
+            <w:tcW w:w="2600" w:type="dxa"/>
+            <w:tcMar>
+              <w:top w:w="60" w:type="dxa"/>
+              <w:left w:w="100" w:type="dxa"/>
+              <w:bottom w:w="60" w:type="dxa"/>
+              <w:right w:w="100" w:type="dxa"/>
+            </w:tcMar>
+            <w:vAlign w:val="center"/>
+          </w:tcPr>
+          <w:p>
+            <w:r>
+              <w:rPr>
+                <w:sz w:val="20"/>
+                <w:szCs w:val="20"/>
+              </w:rPr>
+              <w:t>Inclui</w:t>
+            </w:r>
+          </w:p>
+        </w:tc>
+        <w:tc>
+          <w:tcPr>
+            <w:tcW w:w="6200" w:type="dxa"/>
+            <w:tcMar>
+              <w:top w:w="60" w:type="dxa"/>
+              <w:left w:w="100" w:type="dxa"/>
+              <w:bottom w:w="60" w:type="dxa"/>
+              <w:right w:w="100" w:type="dxa"/>
+            </w:tcMar>
+            <w:vAlign w:val="center"/>
+          </w:tcPr>
+          <w:p>
+            <w:r>
+              <w:rPr>
+                <w:sz w:val="20"/>
+                <w:szCs w:val="20"/>
+              </w:rPr>
+              <w:t>material de apoio em PDF e gravação do encontro (formato remoto)</w:t>
+            </w:r>
+          </w:p>
+        </w:tc>
+      </w:tr>
+      <w:tr>
+        <w:trPr>
+          <w:jc w:val="center"/>
+        </w:trPr>
+        <w:tc>
+          <w:tcPr>
+            <w:tcW w:w="2600" w:type="dxa"/>
+            <w:tcMar>
+              <w:top w:w="60" w:type="dxa"/>
+              <w:left w:w="100" w:type="dxa"/>
+              <w:bottom w:w="60" w:type="dxa"/>
+              <w:right w:w="100" w:type="dxa"/>
+            </w:tcMar>
+            <w:vAlign w:val="center"/>
+          </w:tcPr>
+          <w:p>
+            <w:r>
+              <w:rPr>
+                <w:sz w:val="20"/>
+                <w:szCs w:val="20"/>
+              </w:rPr>
+              <w:t>Turma adicional no mesmo dia</w:t>
+            </w:r>
+          </w:p>
+        </w:tc>
+        <w:tc>
+          <w:tcPr>
+            <w:tcW w:w="6200" w:type="dxa"/>
+            <w:tcMar>
+              <w:top w:w="60" w:type="dxa"/>
+              <w:left w:w="100" w:type="dxa"/>
+              <w:bottom w:w="60" w:type="dxa"/>
+              <w:right w:w="100" w:type="dxa"/>
+            </w:tcMar>
+            <w:vAlign w:val="center"/>
+          </w:tcPr>
+          <w:p>
+            <w:r>
+              <w:rPr>
+                <w:sz w:val="20"/>
+                <w:szCs w:val="20"/>
+              </w:rPr>
+              <w:t>R$ 800 por turma</w:t>
+            </w:r>
+          </w:p>
+        </w:tc>
+      </w:tr>
+      <w:tr>
+        <w:trPr>
+          <w:jc w:val="center"/>
+        </w:trPr>
+        <w:tc>
+          <w:tcPr>
+            <w:tcW w:w="2600" w:type="dxa"/>
+            <w:tcMar>
+              <w:top w:w="60" w:type="dxa"/>
+              <w:left w:w="100" w:type="dxa"/>
+              <w:bottom w:w="60" w:type="dxa"/>
+              <w:right w:w="100" w:type="dxa"/>
+            </w:tcMar>
+            <w:vAlign w:val="center"/>
+          </w:tcPr>
+          <w:p>
+            <w:r>
+              <w:rPr>
+                <w:sz w:val="20"/>
+                <w:szCs w:val="20"/>
+              </w:rPr>
+              <w:t>Presencial</w:t>
+            </w:r>
+          </w:p>
+        </w:tc>
+        <w:tc>
+          <w:tcPr>
+            <w:tcW w:w="6200" w:type="dxa"/>
+            <w:tcMar>
+              <w:top w:w="60" w:type="dxa"/>
+              <w:left w:w="100" w:type="dxa"/>
+              <w:bottom w:w="60" w:type="dxa"/>
+              <w:right w:w="100" w:type="dxa"/>
+            </w:tcMar>
+            <w:vAlign w:val="center"/>
+          </w:tcPr>
+          <w:p>
+            <w:r>
+              <w:rPr>
+                <w:sz w:val="20"/>
+                <w:szCs w:val="20"/>
+              </w:rPr>
+              <w:t>acrescem-se deslocamento, hospedagem e alimentação, orçados previamente</w:t>
             </w:r>
           </w:p>
         </w:tc>
@@ -1771,8 +1821,110 @@
     </w:p>
     <w:p>
       <w:pPr>
+        <w:pStyle w:val="PargrafodaLista"/>
+        <w:numPr>
+          <w:ilvl w:val="0"/>
+          <w:numId w:val="2"/>
+        </w:numPr>
+        <w:spacing w:after="80"/>
+        <w:jc w:val="both"/>
+      </w:pPr>
+      <w:r>
+        <w:t>Não inclui a análise de casos concretos do órgão durante o treinamento. Dúvidas sobre um edital específico são bem-vindas como exemplo, mas a análise em si é serviço próprio, orçado à parte — do contrário a capacitação se converte em consultoria não contratada.</w:t>
+      </w:r>
+    </w:p>
+    <w:p>
+      <w:pPr>
         <w:pStyle w:val="Ttulo2"/>
         <w:spacing w:before="200" w:after="90"/>
+        <w:jc w:val="both"/>
+      </w:pPr>
+      <w:r>
+        <w:rPr>
+          <w:color w:val="1A5C6E"/>
+        </w:rPr>
+        <w:t>Desenvolvimento de módulo sob medida — orçamento por projeto</w:t>
+      </w:r>
+    </w:p>
+    <w:p>
+      <w:pPr>
+        <w:spacing w:after="120"/>
+        <w:jc w:val="both"/>
+      </w:pPr>
+      <w:r>
+        <w:t>Demanda específica que exija programação nova e passe a integrar o sistema. Orçamento fechado após levantamento de escopo, com prazo, entregas e forma de pagamento definidos. Módulos assim desenvolvidos permanecem parte da plataforma e podem ser disponibilizados a outros clientes, salvo acordo expresso em contrário.</w:t>
+      </w:r>
+    </w:p>
+    <w:p>
+      <w:pPr>
+        <w:pStyle w:val="Ttulo2"/>
+        <w:spacing w:before="200" w:after="90"/>
+        <w:jc w:val="both"/>
+      </w:pPr>
+      <w:r>
+        <w:rPr>
+          <w:color w:val="1A5C6E"/>
+        </w:rPr>
+        <w:t>Parecer jurídico sobre caso concreto — tabela do consultor jurídico</w:t>
+      </w:r>
+    </w:p>
+    <w:p>
+      <w:pPr>
+        <w:spacing w:after="120"/>
+        <w:jc w:val="both"/>
+      </w:pPr>
+      <w:r>
+        <w:t>A análise jurídica de situação específica, com responsabilidade técnica de advogado, é serviço privativo da advocacia e NÃO integra a plataforma.</w:t>
+      </w:r>
+    </w:p>
+    <w:p>
+      <w:pPr>
+        <w:pStyle w:val="PargrafodaLista"/>
+        <w:numPr>
+          <w:ilvl w:val="0"/>
+          <w:numId w:val="2"/>
+        </w:numPr>
+        <w:spacing w:after="80"/>
+        <w:jc w:val="both"/>
+      </w:pPr>
+      <w:r>
+        <w:t>O valor segue a TABELA DE HONORÁRIOS DO CONSULTOR JURÍDICO e é definido EXCLUSIVAMENTE POR ELE, conforme a complexidade do caso e os parâmetros da OAB.</w:t>
+      </w:r>
+    </w:p>
+    <w:p>
+      <w:pPr>
+        <w:pStyle w:val="PargrafodaLista"/>
+        <w:numPr>
+          <w:ilvl w:val="0"/>
+          <w:numId w:val="2"/>
+        </w:numPr>
+        <w:spacing w:after="80"/>
+        <w:jc w:val="both"/>
+      </w:pPr>
+      <w:r>
+        <w:lastRenderedPageBreak/>
+        <w:t>A contratação é direta entre o cliente e o consultor. A RM Vértice Digital não intermedeia, não fatura e não participa desses honorários.</w:t>
+      </w:r>
+    </w:p>
+    <w:p>
+      <w:pPr>
+        <w:pStyle w:val="PargrafodaLista"/>
+        <w:numPr>
+          <w:ilvl w:val="0"/>
+          <w:numId w:val="2"/>
+        </w:numPr>
+        <w:spacing w:after="80"/>
+        <w:jc w:val="both"/>
+      </w:pPr>
+      <w:r>
+        <w:t>A plataforma pode indicar o consultor quando a demanda exigir parecer, mas preço, escopo e contratação são tratados entre cliente e advogado.</w:t>
+      </w:r>
+    </w:p>
+    <w:p>
+      <w:pPr>
+        <w:pStyle w:val="Ttulo2"/>
+        <w:spacing w:before="200" w:after="90"/>
+        <w:jc w:val="both"/>
       </w:pPr>
       <w:r>
         <w:rPr>
@@ -1913,23 +2065,17 @@
         <w:tblLook w:val="0000" w:firstRow="0" w:lastRow="0" w:firstColumn="0" w:lastColumn="0" w:noHBand="0" w:noVBand="0"/>
       </w:tblPr>
       <w:tblGrid>
-        <w:gridCol w:w="1143"/>
-        <w:gridCol w:w="4870"/>
+        <w:gridCol w:w="1413"/>
+        <w:gridCol w:w="4600"/>
         <w:gridCol w:w="2787"/>
       </w:tblGrid>
       <w:tr>
-        <w:tblPrEx>
-          <w:tblCellMar>
-            <w:top w:w="0" w:type="dxa"/>
-            <w:bottom w:w="0" w:type="dxa"/>
-          </w:tblCellMar>
-        </w:tblPrEx>
         <w:trPr>
           <w:jc w:val="center"/>
         </w:trPr>
         <w:tc>
           <w:tcPr>
-            <w:tcW w:w="1100" w:type="dxa"/>
+            <w:tcW w:w="1413" w:type="dxa"/>
             <w:shd w:val="clear" w:color="auto" w:fill="F2F2F2"/>
             <w:tcMar>
               <w:top w:w="60" w:type="dxa"/>
@@ -1937,6 +2083,7 @@
               <w:bottom w:w="60" w:type="dxa"/>
               <w:right w:w="100" w:type="dxa"/>
             </w:tcMar>
+            <w:vAlign w:val="center"/>
           </w:tcPr>
           <w:p>
             <w:pPr>
@@ -1955,7 +2102,7 @@
         </w:tc>
         <w:tc>
           <w:tcPr>
-            <w:tcW w:w="4900" w:type="dxa"/>
+            <w:tcW w:w="4600" w:type="dxa"/>
             <w:shd w:val="clear" w:color="auto" w:fill="F2F2F2"/>
             <w:tcMar>
               <w:top w:w="60" w:type="dxa"/>
@@ -1963,6 +2110,7 @@
               <w:bottom w:w="60" w:type="dxa"/>
               <w:right w:w="100" w:type="dxa"/>
             </w:tcMar>
+            <w:vAlign w:val="center"/>
           </w:tcPr>
           <w:p>
             <w:pPr>
@@ -1981,7 +2129,7 @@
         </w:tc>
         <w:tc>
           <w:tcPr>
-            <w:tcW w:w="2800" w:type="dxa"/>
+            <w:tcW w:w="2787" w:type="dxa"/>
             <w:shd w:val="clear" w:color="auto" w:fill="F2F2F2"/>
             <w:tcMar>
               <w:top w:w="60" w:type="dxa"/>
@@ -1989,6 +2137,7 @@
               <w:bottom w:w="60" w:type="dxa"/>
               <w:right w:w="100" w:type="dxa"/>
             </w:tcMar>
+            <w:vAlign w:val="center"/>
           </w:tcPr>
           <w:p>
             <w:pPr>
@@ -2007,24 +2156,19 @@
         </w:tc>
       </w:tr>
       <w:tr>
-        <w:tblPrEx>
-          <w:tblCellMar>
-            <w:top w:w="0" w:type="dxa"/>
-            <w:bottom w:w="0" w:type="dxa"/>
-          </w:tblCellMar>
-        </w:tblPrEx>
         <w:trPr>
           <w:jc w:val="center"/>
         </w:trPr>
         <w:tc>
           <w:tcPr>
-            <w:tcW w:w="1100" w:type="dxa"/>
-            <w:tcMar>
-              <w:top w:w="60" w:type="dxa"/>
-              <w:left w:w="100" w:type="dxa"/>
-              <w:bottom w:w="60" w:type="dxa"/>
-              <w:right w:w="100" w:type="dxa"/>
-            </w:tcMar>
+            <w:tcW w:w="1413" w:type="dxa"/>
+            <w:tcMar>
+              <w:top w:w="60" w:type="dxa"/>
+              <w:left w:w="100" w:type="dxa"/>
+              <w:bottom w:w="60" w:type="dxa"/>
+              <w:right w:w="100" w:type="dxa"/>
+            </w:tcMar>
+            <w:vAlign w:val="center"/>
           </w:tcPr>
           <w:p>
             <w:r>
@@ -2038,13 +2182,14 @@
         </w:tc>
         <w:tc>
           <w:tcPr>
-            <w:tcW w:w="4900" w:type="dxa"/>
-            <w:tcMar>
-              <w:top w:w="60" w:type="dxa"/>
-              <w:left w:w="100" w:type="dxa"/>
-              <w:bottom w:w="60" w:type="dxa"/>
-              <w:right w:w="100" w:type="dxa"/>
-            </w:tcMar>
+            <w:tcW w:w="4600" w:type="dxa"/>
+            <w:tcMar>
+              <w:top w:w="60" w:type="dxa"/>
+              <w:left w:w="100" w:type="dxa"/>
+              <w:bottom w:w="60" w:type="dxa"/>
+              <w:right w:w="100" w:type="dxa"/>
+            </w:tcMar>
+            <w:vAlign w:val="center"/>
           </w:tcPr>
           <w:p>
             <w:r>
@@ -2058,13 +2203,14 @@
         </w:tc>
         <w:tc>
           <w:tcPr>
-            <w:tcW w:w="2800" w:type="dxa"/>
-            <w:tcMar>
-              <w:top w:w="60" w:type="dxa"/>
-              <w:left w:w="100" w:type="dxa"/>
-              <w:bottom w:w="60" w:type="dxa"/>
-              <w:right w:w="100" w:type="dxa"/>
-            </w:tcMar>
+            <w:tcW w:w="2787" w:type="dxa"/>
+            <w:tcMar>
+              <w:top w:w="60" w:type="dxa"/>
+              <w:left w:w="100" w:type="dxa"/>
+              <w:bottom w:w="60" w:type="dxa"/>
+              <w:right w:w="100" w:type="dxa"/>
+            </w:tcMar>
+            <w:vAlign w:val="center"/>
           </w:tcPr>
           <w:p>
             <w:r>
@@ -2078,24 +2224,19 @@
         </w:tc>
       </w:tr>
       <w:tr>
-        <w:tblPrEx>
-          <w:tblCellMar>
-            <w:top w:w="0" w:type="dxa"/>
-            <w:bottom w:w="0" w:type="dxa"/>
-          </w:tblCellMar>
-        </w:tblPrEx>
         <w:trPr>
           <w:jc w:val="center"/>
         </w:trPr>
         <w:tc>
           <w:tcPr>
-            <w:tcW w:w="1100" w:type="dxa"/>
-            <w:tcMar>
-              <w:top w:w="60" w:type="dxa"/>
-              <w:left w:w="100" w:type="dxa"/>
-              <w:bottom w:w="60" w:type="dxa"/>
-              <w:right w:w="100" w:type="dxa"/>
-            </w:tcMar>
+            <w:tcW w:w="1413" w:type="dxa"/>
+            <w:tcMar>
+              <w:top w:w="60" w:type="dxa"/>
+              <w:left w:w="100" w:type="dxa"/>
+              <w:bottom w:w="60" w:type="dxa"/>
+              <w:right w:w="100" w:type="dxa"/>
+            </w:tcMar>
+            <w:vAlign w:val="center"/>
           </w:tcPr>
           <w:p>
             <w:r>
@@ -2109,13 +2250,14 @@
         </w:tc>
         <w:tc>
           <w:tcPr>
-            <w:tcW w:w="4900" w:type="dxa"/>
-            <w:tcMar>
-              <w:top w:w="60" w:type="dxa"/>
-              <w:left w:w="100" w:type="dxa"/>
-              <w:bottom w:w="60" w:type="dxa"/>
-              <w:right w:w="100" w:type="dxa"/>
-            </w:tcMar>
+            <w:tcW w:w="4600" w:type="dxa"/>
+            <w:tcMar>
+              <w:top w:w="60" w:type="dxa"/>
+              <w:left w:w="100" w:type="dxa"/>
+              <w:bottom w:w="60" w:type="dxa"/>
+              <w:right w:w="100" w:type="dxa"/>
+            </w:tcMar>
+            <w:vAlign w:val="center"/>
           </w:tcPr>
           <w:p>
             <w:r>
@@ -2129,13 +2271,14 @@
         </w:tc>
         <w:tc>
           <w:tcPr>
-            <w:tcW w:w="2800" w:type="dxa"/>
-            <w:tcMar>
-              <w:top w:w="60" w:type="dxa"/>
-              <w:left w:w="100" w:type="dxa"/>
-              <w:bottom w:w="60" w:type="dxa"/>
-              <w:right w:w="100" w:type="dxa"/>
-            </w:tcMar>
+            <w:tcW w:w="2787" w:type="dxa"/>
+            <w:tcMar>
+              <w:top w:w="60" w:type="dxa"/>
+              <w:left w:w="100" w:type="dxa"/>
+              <w:bottom w:w="60" w:type="dxa"/>
+              <w:right w:w="100" w:type="dxa"/>
+            </w:tcMar>
+            <w:vAlign w:val="center"/>
           </w:tcPr>
           <w:p>
             <w:r>
@@ -2149,24 +2292,19 @@
         </w:tc>
       </w:tr>
       <w:tr>
-        <w:tblPrEx>
-          <w:tblCellMar>
-            <w:top w:w="0" w:type="dxa"/>
-            <w:bottom w:w="0" w:type="dxa"/>
-          </w:tblCellMar>
-        </w:tblPrEx>
         <w:trPr>
           <w:jc w:val="center"/>
         </w:trPr>
         <w:tc>
           <w:tcPr>
-            <w:tcW w:w="1100" w:type="dxa"/>
-            <w:tcMar>
-              <w:top w:w="60" w:type="dxa"/>
-              <w:left w:w="100" w:type="dxa"/>
-              <w:bottom w:w="60" w:type="dxa"/>
-              <w:right w:w="100" w:type="dxa"/>
-            </w:tcMar>
+            <w:tcW w:w="1413" w:type="dxa"/>
+            <w:tcMar>
+              <w:top w:w="60" w:type="dxa"/>
+              <w:left w:w="100" w:type="dxa"/>
+              <w:bottom w:w="60" w:type="dxa"/>
+              <w:right w:w="100" w:type="dxa"/>
+            </w:tcMar>
+            <w:vAlign w:val="center"/>
           </w:tcPr>
           <w:p>
             <w:r>
@@ -2180,13 +2318,14 @@
         </w:tc>
         <w:tc>
           <w:tcPr>
-            <w:tcW w:w="4900" w:type="dxa"/>
-            <w:tcMar>
-              <w:top w:w="60" w:type="dxa"/>
-              <w:left w:w="100" w:type="dxa"/>
-              <w:bottom w:w="60" w:type="dxa"/>
-              <w:right w:w="100" w:type="dxa"/>
-            </w:tcMar>
+            <w:tcW w:w="4600" w:type="dxa"/>
+            <w:tcMar>
+              <w:top w:w="60" w:type="dxa"/>
+              <w:left w:w="100" w:type="dxa"/>
+              <w:bottom w:w="60" w:type="dxa"/>
+              <w:right w:w="100" w:type="dxa"/>
+            </w:tcMar>
+            <w:vAlign w:val="center"/>
           </w:tcPr>
           <w:p>
             <w:r>
@@ -2216,13 +2355,14 @@
         </w:tc>
         <w:tc>
           <w:tcPr>
-            <w:tcW w:w="2800" w:type="dxa"/>
-            <w:tcMar>
-              <w:top w:w="60" w:type="dxa"/>
-              <w:left w:w="100" w:type="dxa"/>
-              <w:bottom w:w="60" w:type="dxa"/>
-              <w:right w:w="100" w:type="dxa"/>
-            </w:tcMar>
+            <w:tcW w:w="2787" w:type="dxa"/>
+            <w:tcMar>
+              <w:top w:w="60" w:type="dxa"/>
+              <w:left w:w="100" w:type="dxa"/>
+              <w:bottom w:w="60" w:type="dxa"/>
+              <w:right w:w="100" w:type="dxa"/>
+            </w:tcMar>
+            <w:vAlign w:val="center"/>
           </w:tcPr>
           <w:p>
             <w:r>
@@ -2260,7 +2400,6 @@
         <w:rPr>
           <w:color w:val="1A5C6E"/>
         </w:rPr>
-        <w:lastRenderedPageBreak/>
         <w:t>8. Metas iniciais (6 meses)</w:t>
       </w:r>
     </w:p>
@@ -2330,6 +2469,7 @@
         <w:jc w:val="both"/>
       </w:pPr>
       <w:r>
+        <w:lastRenderedPageBreak/>
         <w:t>Preço acima da capacidade do município pequeno → o plano Básico e o avulso mantêm porta de entrada acessível; o piloto gratuito reduz a barreira inicial.</w:t>
       </w:r>
     </w:p>
@@ -2439,10 +2579,10 @@
 <file path=word/numbering.xml><?xml version="1.0" encoding="utf-8"?>
 <w:numbering xmlns:wpc="http://schemas.microsoft.com/office/word/2010/wordprocessingCanvas" xmlns:cx="http://schemas.microsoft.com/office/drawing/2014/chartex" xmlns:cx1="http://schemas.microsoft.com/office/drawing/2015/9/8/chartex" xmlns:cx2="http://schemas.microsoft.com/office/drawing/2015/10/21/chartex" xmlns:cx3="http://schemas.microsoft.com/office/drawing/2016/5/9/chartex" xmlns:cx4="http://schemas.microsoft.com/office/drawing/2016/5/10/chartex" xmlns:cx5="http://schemas.microsoft.com/office/drawing/2016/5/11/chartex" xmlns:cx6="http://schemas.microsoft.com/office/drawing/2016/5/12/chartex" xmlns:cx7="http://schemas.microsoft.com/office/drawing/2016/5/13/chartex" xmlns:cx8="http://schemas.microsoft.com/office/drawing/2016/5/14/chartex" xmlns:mc="http://schemas.openxmlformats.org/markup-compatibility/2006" xmlns:m="http://schemas.openxmlformats.org/officeDocument/2006/math" xmlns:aink="http://schemas.microsoft.com/office/drawing/2016/ink" xmlns:am3d="http://schemas.microsoft.com/office/drawing/2017/model3d" xmlns:oel="http://schemas.microsoft.com/office/2019/extlst" xmlns:r="http://schemas.openxmlformats.org/officeDocument/2006/relationships" xmlns:wp14="http://schemas.microsoft.com/office/word/2010/wordprocessingDrawing" xmlns:wp="http://schemas.openxmlformats.org/drawingml/2006/wordprocessingDrawing" xmlns:wpg="http://schemas.microsoft.com/office/word/2010/wordprocessingGroup" xmlns:wpi="http://schemas.microsoft.com/office/word/2010/wordprocessingInk" xmlns:wps="http://schemas.microsoft.com/office/word/2010/wordprocessingShape" xmlns:o="urn:schemas-microsoft-com:office:office" xmlns:v="urn:schemas-microsoft-com:vml" xmlns:w10="urn:schemas-microsoft-com:office:word" xmlns:w="http://schemas.openxmlformats.org/wordprocessingml/2006/main" xmlns:w14="http://schemas.microsoft.com/office/word/2010/wordml" xmlns:w15="http://schemas.microsoft.com/office/word/2012/wordml" xmlns:w16cei="http://schemas.microsoft.com/office/word/2026/wordml/cei" xmlns:w16cex="http://schemas.microsoft.com/office/word/2018/wordml/cex" xmlns:w16cid="http://schemas.microsoft.com/office/word/2016/wordml/cid" xmlns:w16="http://schemas.microsoft.com/office/word/2018/wordml" xmlns:w16sdtdh="http://schemas.microsoft.com/office/word/2020/wordml/sdtdatahash" xmlns:w16sdtfl="http://schemas.microsoft.com/office/word/2024/wordml/sdtformatlock" xmlns:w16se="http://schemas.microsoft.com/office/word/2015/wordml/symex" xmlns:w16du="http://schemas.microsoft.com/office/word/2023/wordml/word16du" xmlns:wne="http://schemas.microsoft.com/office/word/2006/wordml" mc:Ignorable="w14 w15 w16se w16cid w16 w16cex w16sdtdh w16sdtfl w16du wp14">
   <w:abstractNum w:abstractNumId="0" w15:restartNumberingAfterBreak="0">
-    <w:nsid w:val="332F5342"/>
+    <w:nsid w:val="1D2B3B59"/>
     <w:multiLevelType w:val="hybridMultilevel"/>
-    <w:tmpl w:val="A0B00F9E"/>
-    <w:lvl w:ilvl="0" w:tplc="87A2B788">
+    <w:tmpl w:val="11703168"/>
+    <w:lvl w:ilvl="0" w:tplc="E45AE0E4">
       <w:start w:val="1"/>
       <w:numFmt w:val="bullet"/>
       <w:lvlText w:val="•"/>
@@ -2451,52 +2591,52 @@
         <w:ind w:left="360" w:hanging="200"/>
       </w:pPr>
     </w:lvl>
-    <w:lvl w:ilvl="1" w:tplc="7302AA24">
+    <w:lvl w:ilvl="1" w:tplc="28362B02">
       <w:numFmt w:val="decimal"/>
       <w:lvlText w:val=""/>
       <w:lvlJc w:val="left"/>
     </w:lvl>
-    <w:lvl w:ilvl="2" w:tplc="B964CE78">
+    <w:lvl w:ilvl="2" w:tplc="4AFADB58">
       <w:numFmt w:val="decimal"/>
       <w:lvlText w:val=""/>
       <w:lvlJc w:val="left"/>
     </w:lvl>
-    <w:lvl w:ilvl="3" w:tplc="70F6FA84">
+    <w:lvl w:ilvl="3" w:tplc="7796246A">
       <w:numFmt w:val="decimal"/>
       <w:lvlText w:val=""/>
       <w:lvlJc w:val="left"/>
     </w:lvl>
-    <w:lvl w:ilvl="4" w:tplc="21A64FF6">
+    <w:lvl w:ilvl="4" w:tplc="3E662F40">
       <w:numFmt w:val="decimal"/>
       <w:lvlText w:val=""/>
       <w:lvlJc w:val="left"/>
     </w:lvl>
-    <w:lvl w:ilvl="5" w:tplc="E96ED49C">
+    <w:lvl w:ilvl="5" w:tplc="160419B8">
       <w:numFmt w:val="decimal"/>
       <w:lvlText w:val=""/>
       <w:lvlJc w:val="left"/>
     </w:lvl>
-    <w:lvl w:ilvl="6" w:tplc="1454546E">
+    <w:lvl w:ilvl="6" w:tplc="23F6E234">
       <w:numFmt w:val="decimal"/>
       <w:lvlText w:val=""/>
       <w:lvlJc w:val="left"/>
     </w:lvl>
-    <w:lvl w:ilvl="7" w:tplc="62444254">
+    <w:lvl w:ilvl="7" w:tplc="81508242">
       <w:numFmt w:val="decimal"/>
       <w:lvlText w:val=""/>
       <w:lvlJc w:val="left"/>
     </w:lvl>
-    <w:lvl w:ilvl="8" w:tplc="E9B2FCD4">
+    <w:lvl w:ilvl="8" w:tplc="A57030C4">
       <w:numFmt w:val="decimal"/>
       <w:lvlText w:val=""/>
       <w:lvlJc w:val="left"/>
     </w:lvl>
   </w:abstractNum>
   <w:abstractNum w:abstractNumId="1" w15:restartNumberingAfterBreak="0">
-    <w:nsid w:val="5232165B"/>
+    <w:nsid w:val="3C781908"/>
     <w:multiLevelType w:val="hybridMultilevel"/>
-    <w:tmpl w:val="F4EA4442"/>
-    <w:lvl w:ilvl="0" w:tplc="EA08B9C0">
+    <w:tmpl w:val="EFD4554C"/>
+    <w:lvl w:ilvl="0" w:tplc="BC74398C">
       <w:start w:val="1"/>
       <w:numFmt w:val="bullet"/>
       <w:lvlText w:val="●"/>
@@ -2505,7 +2645,7 @@
         <w:ind w:left="720" w:hanging="360"/>
       </w:pPr>
     </w:lvl>
-    <w:lvl w:ilvl="1" w:tplc="68DE9C92">
+    <w:lvl w:ilvl="1" w:tplc="07F80482">
       <w:start w:val="1"/>
       <w:numFmt w:val="bullet"/>
       <w:lvlText w:val="○"/>
@@ -2514,7 +2654,7 @@
         <w:ind w:left="1440" w:hanging="360"/>
       </w:pPr>
     </w:lvl>
-    <w:lvl w:ilvl="2" w:tplc="32D43504">
+    <w:lvl w:ilvl="2" w:tplc="4E6E4860">
       <w:start w:val="1"/>
       <w:numFmt w:val="bullet"/>
       <w:lvlText w:val="■"/>
@@ -2523,7 +2663,7 @@
         <w:ind w:left="2160" w:hanging="360"/>
       </w:pPr>
     </w:lvl>
-    <w:lvl w:ilvl="3" w:tplc="313EA22A">
+    <w:lvl w:ilvl="3" w:tplc="1D662368">
       <w:start w:val="1"/>
       <w:numFmt w:val="bullet"/>
       <w:lvlText w:val="●"/>
@@ -2532,7 +2672,7 @@
         <w:ind w:left="2880" w:hanging="360"/>
       </w:pPr>
     </w:lvl>
-    <w:lvl w:ilvl="4" w:tplc="A0242A0C">
+    <w:lvl w:ilvl="4" w:tplc="9DC03D60">
       <w:start w:val="1"/>
       <w:numFmt w:val="bullet"/>
       <w:lvlText w:val="○"/>
@@ -2541,7 +2681,7 @@
         <w:ind w:left="3600" w:hanging="360"/>
       </w:pPr>
     </w:lvl>
-    <w:lvl w:ilvl="5" w:tplc="8DCC7366">
+    <w:lvl w:ilvl="5" w:tplc="D690EDF2">
       <w:start w:val="1"/>
       <w:numFmt w:val="bullet"/>
       <w:lvlText w:val="■"/>
@@ -2550,7 +2690,7 @@
         <w:ind w:left="4320" w:hanging="360"/>
       </w:pPr>
     </w:lvl>
-    <w:lvl w:ilvl="6" w:tplc="AFB8A604">
+    <w:lvl w:ilvl="6" w:tplc="15E8A5A0">
       <w:start w:val="1"/>
       <w:numFmt w:val="bullet"/>
       <w:lvlText w:val="●"/>
@@ -2559,7 +2699,7 @@
         <w:ind w:left="5040" w:hanging="360"/>
       </w:pPr>
     </w:lvl>
-    <w:lvl w:ilvl="7" w:tplc="811ED22C">
+    <w:lvl w:ilvl="7" w:tplc="72545DA0">
       <w:start w:val="1"/>
       <w:numFmt w:val="bullet"/>
       <w:lvlText w:val="●"/>
@@ -2568,7 +2708,7 @@
         <w:ind w:left="5760" w:hanging="360"/>
       </w:pPr>
     </w:lvl>
-    <w:lvl w:ilvl="8" w:tplc="5822A428">
+    <w:lvl w:ilvl="8" w:tplc="5D2E1B06">
       <w:start w:val="1"/>
       <w:numFmt w:val="bullet"/>
       <w:lvlText w:val="●"/>
@@ -2578,13 +2718,13 @@
       </w:pPr>
     </w:lvl>
   </w:abstractNum>
-  <w:num w:numId="1" w16cid:durableId="451898004">
+  <w:num w:numId="1" w16cid:durableId="1610623835">
     <w:abstractNumId w:val="1"/>
     <w:lvlOverride w:ilvl="0">
       <w:startOverride w:val="1"/>
     </w:lvlOverride>
   </w:num>
-  <w:num w:numId="2" w16cid:durableId="263849917">
+  <w:num w:numId="2" w16cid:durableId="1944653728">
     <w:abstractNumId w:val="0"/>
     <w:lvlOverride w:ilvl="0">
       <w:startOverride w:val="1"/>

</xml_diff>